<commit_message>
update report & figure
</commit_message>
<xml_diff>
--- a/bai-tap/bai-tap-nhom/Bài tập nhóm - Quản lý nhà sách/Báo cáo Bài tập nhóm - Quản lý nhà sách.docx
+++ b/bai-tap/bai-tap-nhom/Bài tập nhóm - Quản lý nhà sách/Báo cáo Bài tập nhóm - Quản lý nhà sách.docx
@@ -13,8 +13,8 @@
           <w:szCs w:val="26"/>
         </w:rPr>
       </w:pPr>
-      <w:bookmarkStart w:id="0" w:name="_Toc51061469"/>
-      <w:bookmarkStart w:id="1" w:name="_Toc51060025"/>
+      <w:bookmarkStart w:id="0" w:name="_Toc51060025"/>
+      <w:bookmarkStart w:id="1" w:name="_Toc51061469"/>
       <w:r>
         <w:rPr>
           <w:rFonts w:cs="Times New Roman"/>
@@ -2215,23 +2215,7 @@
           <w:noProof/>
           <w:lang w:val="en-US"/>
         </w:rPr>
-        <w:t>A</w:t>
-      </w:r>
-      <w:r>
-        <w:rPr>
-          <w:rFonts w:cs="Times New Roman"/>
-          <w:noProof/>
-          <w:lang w:val="en-US"/>
-        </w:rPr>
-        <w:t>aaaaaaaaaaaaaaaaaaaaaaaaaaaaaaaaaaaaaaaaaaaaaaaaaaaaaaaaaaaaaaaaaaaaaaaaaaaaaaaaaaaaaaaaaaaaaaaaaaaaaaaaaaaaaaaaaaaaaaaaaaaaaaaaaaaaaaaaaaaaaaaaaaaaaaaaaa</w:t>
-      </w:r>
-      <w:r>
-        <w:rPr>
-          <w:rFonts w:cs="Times New Roman"/>
-          <w:noProof/>
-          <w:lang w:val="en-US"/>
-        </w:rPr>
-        <w:t>.</w:t>
+        <w:t>Aaaaaaaaaaaaaaaaaaaaaaaaaaaaaaaaaaaaaaaaaaaaaaaaaaaaaaaaaaaaaaaaaaaaaaaaaaaaaaaaaaaaaaaaaaaaaaaaaaaaaaaaaaaaaaaaaaaaaaaaaaaaaaaaaaaaaaaaaaaaaaaaaaaaaaaaaaa.</w:t>
       </w:r>
     </w:p>
     <w:p>
@@ -2278,23 +2262,7 @@
           <w:noProof/>
           <w:lang w:val="en-US"/>
         </w:rPr>
-        <w:t>A</w:t>
-      </w:r>
-      <w:r>
-        <w:rPr>
-          <w:rFonts w:cs="Times New Roman"/>
-          <w:noProof/>
-          <w:lang w:val="en-US"/>
-        </w:rPr>
-        <w:t>aaaaaaaaaaaaaaaaaaaaaaaaaaaaaaaaaaaaaaaaaaaaaaaaaaaaaaaaaaaaaaaaaaaaaaaaaaaaaaaaaaaaaaaaaaaaaaaaaaaaaaaaaaaaaaaaaaaaaaaaaaaaaaaaaaaaaaaaaaaaaaaaaaaaaaaaa</w:t>
-      </w:r>
-      <w:r>
-        <w:rPr>
-          <w:rFonts w:cs="Times New Roman"/>
-          <w:noProof/>
-          <w:lang w:val="en-US"/>
-        </w:rPr>
-        <w:t>.</w:t>
+        <w:t>Aaaaaaaaaaaaaaaaaaaaaaaaaaaaaaaaaaaaaaaaaaaaaaaaaaaaaaaaaaaaaaaaaaaaaaaaaaaaaaaaaaaaaaaaaaaaaaaaaaaaaaaaaaaaaaaaaaaaaaaaaaaaaaaaaaaaaaaaaaaaaaaaaaaaaaaaaa.</w:t>
       </w:r>
     </w:p>
     <w:p>
@@ -2399,7 +2367,15 @@
           <w:noProof/>
           <w:lang w:val="en-US"/>
         </w:rPr>
-        <w:t>Aaaaaaaaaaaaaaaaaaaaaaaaaaaaaaaaaaaaaaaaaaaaaaaaaaaaaaaaaaaaaaaaaaaaaaaaaaaaaaaaaaaaaaaaaaaaaaaaaaaaaaaaaaaaaaaaaaaaaaaaaaaaaaaaaaaaaaaaaaaaaaaaaaaaaaaaaa.</w:t>
+        <w:t>Đề bài yêu cầu của thầy + Functional &amp; Non-functional requirement</w:t>
+      </w:r>
+      <w:r>
+        <w:rPr>
+          <w:rFonts w:cs="Times New Roman"/>
+          <w:noProof/>
+          <w:lang w:val="en-US"/>
+        </w:rPr>
+        <w:t>.</w:t>
       </w:r>
     </w:p>
     <w:p>
@@ -2738,7 +2714,6 @@
                 <w:szCs w:val="26"/>
                 <w:lang w:val="en-US"/>
               </w:rPr>
-              <w:lastRenderedPageBreak/>
               <w:t>Actor phụ</w:t>
             </w:r>
           </w:p>
@@ -2789,6 +2764,7 @@
                 <w:szCs w:val="26"/>
                 <w:lang w:val="en-US"/>
               </w:rPr>
+              <w:lastRenderedPageBreak/>
               <w:t>Tiền điều kiện</w:t>
             </w:r>
           </w:p>
@@ -3413,7 +3389,6 @@
         <w:rPr>
           <w:noProof/>
         </w:rPr>
-        <w:lastRenderedPageBreak/>
         <w:t>Sơ đồ hoạt động (Activity Diagram)</w:t>
       </w:r>
       <w:bookmarkEnd w:id="17"/>
@@ -3530,6 +3505,7 @@
         <w:rPr>
           <w:noProof/>
         </w:rPr>
+        <w:lastRenderedPageBreak/>
         <w:t>Đánh giá kết quả</w:t>
       </w:r>
       <w:bookmarkEnd w:id="23"/>

</xml_diff>

<commit_message>
update use case diagram & report
</commit_message>
<xml_diff>
--- a/bai-tap/bai-tap-nhom/Bài tập nhóm - Quản lý nhà sách/Báo cáo Bài tập nhóm - Quản lý nhà sách.docx
+++ b/bai-tap/bai-tap-nhom/Bài tập nhóm - Quản lý nhà sách/Báo cáo Bài tập nhóm - Quản lý nhà sách.docx
@@ -13,8 +13,8 @@
           <w:szCs w:val="26"/>
         </w:rPr>
       </w:pPr>
-      <w:bookmarkStart w:id="0" w:name="_Toc51061469"/>
-      <w:bookmarkStart w:id="1" w:name="_Toc51060025"/>
+      <w:bookmarkStart w:id="0" w:name="_Toc51060025"/>
+      <w:bookmarkStart w:id="1" w:name="_Toc51061469"/>
       <w:r>
         <w:rPr>
           <w:rFonts w:cs="Times New Roman"/>
@@ -593,7 +593,7 @@
             </w:rPr>
             <w:fldChar w:fldCharType="separate"/>
           </w:r>
-          <w:hyperlink w:anchor="_Toc88990762" w:history="1">
+          <w:hyperlink w:anchor="_Toc89005341" w:history="1">
             <w:r>
               <w:rPr>
                 <w:rStyle w:val="Hyperlink"/>
@@ -637,7 +637,7 @@
                 <w:noProof/>
                 <w:webHidden/>
               </w:rPr>
-              <w:instrText xml:space="preserve"> PAGEREF _Toc88990762 \h </w:instrText>
+              <w:instrText xml:space="preserve"> PAGEREF _Toc89005341 \h </w:instrText>
             </w:r>
             <w:r>
               <w:rPr>
@@ -682,7 +682,7 @@
               <w:lang w:val="vi-VN" w:eastAsia="vi-VN"/>
             </w:rPr>
           </w:pPr>
-          <w:hyperlink w:anchor="_Toc88990763" w:history="1">
+          <w:hyperlink w:anchor="_Toc89005342" w:history="1">
             <w:r>
               <w:rPr>
                 <w:rStyle w:val="Hyperlink"/>
@@ -726,7 +726,7 @@
                 <w:noProof/>
                 <w:webHidden/>
               </w:rPr>
-              <w:instrText xml:space="preserve"> PAGEREF _Toc88990763 \h </w:instrText>
+              <w:instrText xml:space="preserve"> PAGEREF _Toc89005342 \h </w:instrText>
             </w:r>
             <w:r>
               <w:rPr>
@@ -771,7 +771,7 @@
               <w:lang w:val="vi-VN" w:eastAsia="vi-VN"/>
             </w:rPr>
           </w:pPr>
-          <w:hyperlink w:anchor="_Toc88990764" w:history="1">
+          <w:hyperlink w:anchor="_Toc89005343" w:history="1">
             <w:r>
               <w:rPr>
                 <w:rStyle w:val="Hyperlink"/>
@@ -815,7 +815,7 @@
                 <w:noProof/>
                 <w:webHidden/>
               </w:rPr>
-              <w:instrText xml:space="preserve"> PAGEREF _Toc88990764 \h </w:instrText>
+              <w:instrText xml:space="preserve"> PAGEREF _Toc89005343 \h </w:instrText>
             </w:r>
             <w:r>
               <w:rPr>
@@ -860,7 +860,7 @@
               <w:lang w:val="vi-VN" w:eastAsia="vi-VN"/>
             </w:rPr>
           </w:pPr>
-          <w:hyperlink w:anchor="_Toc88990765" w:history="1">
+          <w:hyperlink w:anchor="_Toc89005344" w:history="1">
             <w:r>
               <w:rPr>
                 <w:rStyle w:val="Hyperlink"/>
@@ -904,7 +904,7 @@
                 <w:noProof/>
                 <w:webHidden/>
               </w:rPr>
-              <w:instrText xml:space="preserve"> PAGEREF _Toc88990765 \h </w:instrText>
+              <w:instrText xml:space="preserve"> PAGEREF _Toc89005344 \h </w:instrText>
             </w:r>
             <w:r>
               <w:rPr>
@@ -949,7 +949,7 @@
               <w:lang w:val="vi-VN" w:eastAsia="vi-VN"/>
             </w:rPr>
           </w:pPr>
-          <w:hyperlink w:anchor="_Toc88990766" w:history="1">
+          <w:hyperlink w:anchor="_Toc89005345" w:history="1">
             <w:r>
               <w:rPr>
                 <w:rStyle w:val="Hyperlink"/>
@@ -993,7 +993,7 @@
                 <w:noProof/>
                 <w:webHidden/>
               </w:rPr>
-              <w:instrText xml:space="preserve"> PAGEREF _Toc88990766 \h </w:instrText>
+              <w:instrText xml:space="preserve"> PAGEREF _Toc89005345 \h </w:instrText>
             </w:r>
             <w:r>
               <w:rPr>
@@ -1038,7 +1038,7 @@
               <w:lang w:val="vi-VN" w:eastAsia="vi-VN"/>
             </w:rPr>
           </w:pPr>
-          <w:hyperlink w:anchor="_Toc88990767" w:history="1">
+          <w:hyperlink w:anchor="_Toc89005346" w:history="1">
             <w:r>
               <w:rPr>
                 <w:rStyle w:val="Hyperlink"/>
@@ -1082,7 +1082,7 @@
                 <w:noProof/>
                 <w:webHidden/>
               </w:rPr>
-              <w:instrText xml:space="preserve"> PAGEREF _Toc88990767 \h </w:instrText>
+              <w:instrText xml:space="preserve"> PAGEREF _Toc89005346 \h </w:instrText>
             </w:r>
             <w:r>
               <w:rPr>
@@ -1127,7 +1127,7 @@
               <w:lang w:eastAsia="vi-VN"/>
             </w:rPr>
           </w:pPr>
-          <w:hyperlink w:anchor="_Toc88990768" w:history="1">
+          <w:hyperlink w:anchor="_Toc89005347" w:history="1">
             <w:r>
               <w:rPr>
                 <w:rStyle w:val="Hyperlink"/>
@@ -1170,7 +1170,7 @@
                 <w:noProof/>
                 <w:webHidden/>
               </w:rPr>
-              <w:instrText xml:space="preserve"> PAGEREF _Toc88990768 \h </w:instrText>
+              <w:instrText xml:space="preserve"> PAGEREF _Toc89005347 \h </w:instrText>
             </w:r>
             <w:r>
               <w:rPr>
@@ -1215,7 +1215,7 @@
               <w:lang w:eastAsia="vi-VN"/>
             </w:rPr>
           </w:pPr>
-          <w:hyperlink w:anchor="_Toc88990769" w:history="1">
+          <w:hyperlink w:anchor="_Toc89005348" w:history="1">
             <w:r>
               <w:rPr>
                 <w:rStyle w:val="Hyperlink"/>
@@ -1258,7 +1258,7 @@
                 <w:noProof/>
                 <w:webHidden/>
               </w:rPr>
-              <w:instrText xml:space="preserve"> PAGEREF _Toc88990769 \h </w:instrText>
+              <w:instrText xml:space="preserve"> PAGEREF _Toc89005348 \h </w:instrText>
             </w:r>
             <w:r>
               <w:rPr>
@@ -1303,7 +1303,7 @@
               <w:lang w:eastAsia="vi-VN"/>
             </w:rPr>
           </w:pPr>
-          <w:hyperlink w:anchor="_Toc88990770" w:history="1">
+          <w:hyperlink w:anchor="_Toc89005349" w:history="1">
             <w:r>
               <w:rPr>
                 <w:rStyle w:val="Hyperlink"/>
@@ -1346,7 +1346,7 @@
                 <w:noProof/>
                 <w:webHidden/>
               </w:rPr>
-              <w:instrText xml:space="preserve"> PAGEREF _Toc88990770 \h </w:instrText>
+              <w:instrText xml:space="preserve"> PAGEREF _Toc89005349 \h </w:instrText>
             </w:r>
             <w:r>
               <w:rPr>
@@ -1391,7 +1391,7 @@
               <w:lang w:eastAsia="vi-VN"/>
             </w:rPr>
           </w:pPr>
-          <w:hyperlink w:anchor="_Toc88990771" w:history="1">
+          <w:hyperlink w:anchor="_Toc89005350" w:history="1">
             <w:r>
               <w:rPr>
                 <w:rStyle w:val="Hyperlink"/>
@@ -1434,7 +1434,7 @@
                 <w:noProof/>
                 <w:webHidden/>
               </w:rPr>
-              <w:instrText xml:space="preserve"> PAGEREF _Toc88990771 \h </w:instrText>
+              <w:instrText xml:space="preserve"> PAGEREF _Toc89005350 \h </w:instrText>
             </w:r>
             <w:r>
               <w:rPr>
@@ -1479,7 +1479,7 @@
               <w:lang w:eastAsia="vi-VN"/>
             </w:rPr>
           </w:pPr>
-          <w:hyperlink w:anchor="_Toc88990772" w:history="1">
+          <w:hyperlink w:anchor="_Toc89005351" w:history="1">
             <w:r>
               <w:rPr>
                 <w:rStyle w:val="Hyperlink"/>
@@ -1522,7 +1522,7 @@
                 <w:noProof/>
                 <w:webHidden/>
               </w:rPr>
-              <w:instrText xml:space="preserve"> PAGEREF _Toc88990772 \h </w:instrText>
+              <w:instrText xml:space="preserve"> PAGEREF _Toc89005351 \h </w:instrText>
             </w:r>
             <w:r>
               <w:rPr>
@@ -1567,7 +1567,7 @@
               <w:lang w:eastAsia="vi-VN"/>
             </w:rPr>
           </w:pPr>
-          <w:hyperlink w:anchor="_Toc88990773" w:history="1">
+          <w:hyperlink w:anchor="_Toc89005352" w:history="1">
             <w:r>
               <w:rPr>
                 <w:rStyle w:val="Hyperlink"/>
@@ -1610,7 +1610,7 @@
                 <w:noProof/>
                 <w:webHidden/>
               </w:rPr>
-              <w:instrText xml:space="preserve"> PAGEREF _Toc88990773 \h </w:instrText>
+              <w:instrText xml:space="preserve"> PAGEREF _Toc89005352 \h </w:instrText>
             </w:r>
             <w:r>
               <w:rPr>
@@ -1655,7 +1655,7 @@
               <w:lang w:val="vi-VN" w:eastAsia="vi-VN"/>
             </w:rPr>
           </w:pPr>
-          <w:hyperlink w:anchor="_Toc88990774" w:history="1">
+          <w:hyperlink w:anchor="_Toc89005353" w:history="1">
             <w:r>
               <w:rPr>
                 <w:rStyle w:val="Hyperlink"/>
@@ -1699,7 +1699,7 @@
                 <w:noProof/>
                 <w:webHidden/>
               </w:rPr>
-              <w:instrText xml:space="preserve"> PAGEREF _Toc88990774 \h </w:instrText>
+              <w:instrText xml:space="preserve"> PAGEREF _Toc89005353 \h </w:instrText>
             </w:r>
             <w:r>
               <w:rPr>
@@ -1829,21 +1829,13 @@
         </w:rPr>
         <w:fldChar w:fldCharType="separate"/>
       </w:r>
-      <w:hyperlink w:anchor="_Toc88990743" w:history="1">
+      <w:hyperlink w:anchor="_Toc89005355" w:history="1">
         <w:r>
           <w:rPr>
             <w:rStyle w:val="Hyperlink"/>
             <w:noProof/>
           </w:rPr>
-          <w:t>Hình 6.1</w:t>
-        </w:r>
-        <w:r>
-          <w:rPr>
-            <w:rStyle w:val="Hyperlink"/>
-            <w:noProof/>
-            <w:lang w:val="en-US"/>
-          </w:rPr>
-          <w:t>: Use Case tổng quan</w:t>
+          <w:t>Hình 6.1: Use Case tổng quan</w:t>
         </w:r>
         <w:r>
           <w:rPr>
@@ -1864,7 +1856,7 @@
             <w:noProof/>
             <w:webHidden/>
           </w:rPr>
-          <w:instrText xml:space="preserve"> PAGEREF _Toc88990743 \h </w:instrText>
+          <w:instrText xml:space="preserve"> PAGEREF _Toc89005355 \h </w:instrText>
         </w:r>
         <w:r>
           <w:rPr>
@@ -1946,10 +1938,8 @@
           <w:tab w:val="right" w:leader="dot" w:pos="9061"/>
         </w:tabs>
         <w:rPr>
-          <w:rFonts w:asciiTheme="minorHAnsi" w:eastAsiaTheme="minorEastAsia" w:hAnsiTheme="minorHAnsi"/>
-          <w:noProof/>
-          <w:sz w:val="22"/>
-          <w:lang w:eastAsia="vi-VN"/>
+          <w:rFonts w:cs="Times New Roman"/>
+          <w:noProof/>
         </w:rPr>
       </w:pPr>
       <w:r>
@@ -1982,7 +1972,7 @@
         </w:rPr>
         <w:fldChar w:fldCharType="separate"/>
       </w:r>
-      <w:hyperlink w:anchor="_Toc88990739" w:history="1">
+      <w:hyperlink w:anchor="_Toc89005356" w:history="1">
         <w:r>
           <w:rPr>
             <w:rStyle w:val="Hyperlink"/>
@@ -2010,7 +2000,7 @@
             <w:noProof/>
             <w:webHidden/>
           </w:rPr>
-          <w:instrText xml:space="preserve"> PAGEREF _Toc88990739 \h </w:instrText>
+          <w:instrText xml:space="preserve"> PAGEREF _Toc89005356 \h </w:instrText>
         </w:r>
         <w:r>
           <w:rPr>
@@ -2040,44 +2030,32 @@
           <w:fldChar w:fldCharType="end"/>
         </w:r>
       </w:hyperlink>
+      <w:r>
+        <w:rPr>
+          <w:rFonts w:cs="Times New Roman"/>
+          <w:b/>
+          <w:noProof/>
+          <w:sz w:val="28"/>
+          <w:szCs w:val="26"/>
+        </w:rPr>
+        <w:fldChar w:fldCharType="end"/>
+      </w:r>
     </w:p>
     <w:p>
       <w:pPr>
-        <w:pStyle w:val="TableofFigures"/>
-        <w:tabs>
-          <w:tab w:val="right" w:leader="dot" w:pos="9061"/>
-        </w:tabs>
-        <w:rPr>
-          <w:rFonts w:cs="Times New Roman"/>
-          <w:noProof/>
-        </w:rPr>
-      </w:pPr>
-      <w:r>
-        <w:rPr>
-          <w:rFonts w:cs="Times New Roman"/>
-          <w:b/>
-          <w:noProof/>
-          <w:sz w:val="28"/>
+        <w:pStyle w:val="Heading1"/>
+        <w:rPr>
+          <w:noProof/>
+        </w:rPr>
+      </w:pPr>
+      <w:r>
+        <w:rPr>
+          <w:noProof/>
           <w:szCs w:val="26"/>
         </w:rPr>
-        <w:fldChar w:fldCharType="end"/>
-      </w:r>
-    </w:p>
-    <w:p>
-      <w:pPr>
-        <w:pStyle w:val="Heading1"/>
-        <w:rPr>
-          <w:noProof/>
-        </w:rPr>
-      </w:pPr>
-      <w:r>
-        <w:rPr>
-          <w:noProof/>
-          <w:szCs w:val="26"/>
-        </w:rPr>
         <w:br w:type="page"/>
       </w:r>
-      <w:bookmarkStart w:id="6" w:name="_Toc88990762"/>
+      <w:bookmarkStart w:id="6" w:name="_Toc89005341"/>
       <w:r>
         <w:rPr>
           <w:noProof/>
@@ -2116,7 +2094,7 @@
           <w:noProof/>
         </w:rPr>
       </w:pPr>
-      <w:bookmarkStart w:id="9" w:name="_Toc88990763"/>
+      <w:bookmarkStart w:id="9" w:name="_Toc89005342"/>
       <w:r>
         <w:rPr>
           <w:noProof/>
@@ -2167,7 +2145,7 @@
           <w:noProof/>
         </w:rPr>
       </w:pPr>
-      <w:bookmarkStart w:id="10" w:name="_Toc88990764"/>
+      <w:bookmarkStart w:id="10" w:name="_Toc89005343"/>
       <w:r>
         <w:rPr>
           <w:noProof/>
@@ -2202,7 +2180,7 @@
           <w:noProof/>
         </w:rPr>
       </w:pPr>
-      <w:bookmarkStart w:id="11" w:name="_Toc88990765"/>
+      <w:bookmarkStart w:id="11" w:name="_Toc89005344"/>
       <w:r>
         <w:rPr>
           <w:noProof/>
@@ -2237,7 +2215,7 @@
           <w:noProof/>
         </w:rPr>
       </w:pPr>
-      <w:bookmarkStart w:id="12" w:name="_Toc88990766"/>
+      <w:bookmarkStart w:id="12" w:name="_Toc89005345"/>
       <w:r>
         <w:rPr>
           <w:noProof/>
@@ -2276,7 +2254,7 @@
           <w:noProof/>
         </w:rPr>
       </w:pPr>
-      <w:bookmarkStart w:id="13" w:name="_Toc88990767"/>
+      <w:bookmarkStart w:id="13" w:name="_Toc89005346"/>
       <w:r>
         <w:rPr>
           <w:noProof/>
@@ -2294,7 +2272,7 @@
           <w:noProof/>
         </w:rPr>
       </w:pPr>
-      <w:bookmarkStart w:id="14" w:name="_Toc88990768"/>
+      <w:bookmarkStart w:id="14" w:name="_Toc89005347"/>
       <w:r>
         <w:rPr>
           <w:noProof/>
@@ -2310,7 +2288,7 @@
           <w:noProof/>
         </w:rPr>
       </w:pPr>
-      <w:bookmarkStart w:id="15" w:name="_Toc88990769"/>
+      <w:bookmarkStart w:id="15" w:name="_Toc89005348"/>
       <w:r>
         <w:rPr>
           <w:noProof/>
@@ -2357,10 +2335,10 @@
           <w:lang w:val="en-US"/>
         </w:rPr>
         <w:drawing>
-          <wp:inline distT="0" distB="0" distL="0" distR="0" wp14:anchorId="576D7370" wp14:editId="61FA3C29">
-            <wp:extent cx="5753100" cy="4998720"/>
+          <wp:inline distT="0" distB="0" distL="0" distR="0" wp14:anchorId="21701810" wp14:editId="47326A6D">
+            <wp:extent cx="5756275" cy="4994275"/>
             <wp:effectExtent l="0" t="0" r="0" b="0"/>
-            <wp:docPr id="1" name="Picture 1"/>
+            <wp:docPr id="2" name="Picture 2"/>
             <wp:cNvGraphicFramePr>
               <a:graphicFrameLocks xmlns:a="http://schemas.openxmlformats.org/drawingml/2006/main" noChangeAspect="1"/>
             </wp:cNvGraphicFramePr>
@@ -2389,7 +2367,7 @@
                   <pic:spPr bwMode="auto">
                     <a:xfrm>
                       <a:off x="0" y="0"/>
-                      <a:ext cx="5753100" cy="4998720"/>
+                      <a:ext cx="5756275" cy="4994275"/>
                     </a:xfrm>
                     <a:prstGeom prst="rect">
                       <a:avLst/>
@@ -2409,11 +2387,8 @@
     <w:p>
       <w:pPr>
         <w:pStyle w:val="Caption"/>
-        <w:rPr>
-          <w:lang w:val="en-US"/>
-        </w:rPr>
-      </w:pPr>
-      <w:bookmarkStart w:id="16" w:name="_Toc88990743"/>
+      </w:pPr>
+      <w:bookmarkStart w:id="16" w:name="_Toc89005355"/>
       <w:r>
         <w:t xml:space="preserve">Hình </w:t>
       </w:r>
@@ -2438,16 +2413,9 @@
       </w:fldSimple>
       <w:r>
         <w:rPr>
-          <w:lang w:val="en-US"/>
-        </w:rPr>
-        <w:t xml:space="preserve">: </w:t>
-      </w:r>
-      <w:r>
-        <w:rPr>
-          <w:noProof/>
-          <w:lang w:val="en-US"/>
-        </w:rPr>
-        <w:t>Use Case tổng quan</w:t>
+          <w:noProof/>
+        </w:rPr>
+        <w:t>: Use Case tổng quan</w:t>
       </w:r>
       <w:bookmarkEnd w:id="16"/>
     </w:p>
@@ -3291,7 +3259,7 @@
           <w:rFonts w:cs="Times New Roman"/>
         </w:rPr>
       </w:pPr>
-      <w:bookmarkStart w:id="17" w:name="_Toc88990739"/>
+      <w:bookmarkStart w:id="17" w:name="_Toc89005356"/>
       <w:r>
         <w:rPr>
           <w:rFonts w:cs="Times New Roman"/>
@@ -3381,7 +3349,7 @@
           <w:noProof/>
         </w:rPr>
       </w:pPr>
-      <w:bookmarkStart w:id="18" w:name="_Toc88990770"/>
+      <w:bookmarkStart w:id="18" w:name="_Toc89005349"/>
       <w:r>
         <w:rPr>
           <w:noProof/>
@@ -3394,7 +3362,7 @@
       <w:pPr>
         <w:pStyle w:val="Heading3"/>
       </w:pPr>
-      <w:bookmarkStart w:id="19" w:name="_Toc88990771"/>
+      <w:bookmarkStart w:id="19" w:name="_Toc89005350"/>
       <w:r>
         <w:t>Sơ đồ tuần tự (Sequence Diagram)</w:t>
       </w:r>
@@ -3408,7 +3376,7 @@
           <w:noProof/>
         </w:rPr>
       </w:pPr>
-      <w:bookmarkStart w:id="20" w:name="_Toc88990772"/>
+      <w:bookmarkStart w:id="20" w:name="_Toc89005351"/>
       <w:r>
         <w:rPr>
           <w:noProof/>
@@ -3424,7 +3392,7 @@
           <w:noProof/>
         </w:rPr>
       </w:pPr>
-      <w:bookmarkStart w:id="21" w:name="_Toc88990773"/>
+      <w:bookmarkStart w:id="21" w:name="_Toc89005352"/>
       <w:r>
         <w:rPr>
           <w:noProof/>
@@ -3440,7 +3408,7 @@
           <w:noProof/>
         </w:rPr>
       </w:pPr>
-      <w:bookmarkStart w:id="22" w:name="_Toc88990774"/>
+      <w:bookmarkStart w:id="22" w:name="_Toc89005353"/>
       <w:r>
         <w:rPr>
           <w:noProof/>

</xml_diff>

<commit_message>
update logic for Use Case Diagram & report
</commit_message>
<xml_diff>
--- a/bai-tap/bai-tap-nhom/Bài tập nhóm - Quản lý nhà sách/Báo cáo Bài tập nhóm - Quản lý nhà sách.docx
+++ b/bai-tap/bai-tap-nhom/Bài tập nhóm - Quản lý nhà sách/Báo cáo Bài tập nhóm - Quản lý nhà sách.docx
@@ -13,8 +13,8 @@
           <w:szCs w:val="26"/>
         </w:rPr>
       </w:pPr>
-      <w:bookmarkStart w:id="0" w:name="_Toc51060025"/>
-      <w:bookmarkStart w:id="1" w:name="_Toc51061469"/>
+      <w:bookmarkStart w:id="0" w:name="_Toc51061469"/>
+      <w:bookmarkStart w:id="1" w:name="_Toc51060025"/>
       <w:r>
         <w:rPr>
           <w:rFonts w:cs="Times New Roman"/>
@@ -593,7 +593,7 @@
             </w:rPr>
             <w:fldChar w:fldCharType="separate"/>
           </w:r>
-          <w:hyperlink w:anchor="_Toc89005341" w:history="1">
+          <w:hyperlink w:anchor="_Toc89015194" w:history="1">
             <w:r>
               <w:rPr>
                 <w:rStyle w:val="Hyperlink"/>
@@ -637,7 +637,7 @@
                 <w:noProof/>
                 <w:webHidden/>
               </w:rPr>
-              <w:instrText xml:space="preserve"> PAGEREF _Toc89005341 \h </w:instrText>
+              <w:instrText xml:space="preserve"> PAGEREF _Toc89015194 \h </w:instrText>
             </w:r>
             <w:r>
               <w:rPr>
@@ -682,7 +682,7 @@
               <w:lang w:val="vi-VN" w:eastAsia="vi-VN"/>
             </w:rPr>
           </w:pPr>
-          <w:hyperlink w:anchor="_Toc89005342" w:history="1">
+          <w:hyperlink w:anchor="_Toc89015195" w:history="1">
             <w:r>
               <w:rPr>
                 <w:rStyle w:val="Hyperlink"/>
@@ -726,7 +726,7 @@
                 <w:noProof/>
                 <w:webHidden/>
               </w:rPr>
-              <w:instrText xml:space="preserve"> PAGEREF _Toc89005342 \h </w:instrText>
+              <w:instrText xml:space="preserve"> PAGEREF _Toc89015195 \h </w:instrText>
             </w:r>
             <w:r>
               <w:rPr>
@@ -771,7 +771,7 @@
               <w:lang w:val="vi-VN" w:eastAsia="vi-VN"/>
             </w:rPr>
           </w:pPr>
-          <w:hyperlink w:anchor="_Toc89005343" w:history="1">
+          <w:hyperlink w:anchor="_Toc89015196" w:history="1">
             <w:r>
               <w:rPr>
                 <w:rStyle w:val="Hyperlink"/>
@@ -815,7 +815,7 @@
                 <w:noProof/>
                 <w:webHidden/>
               </w:rPr>
-              <w:instrText xml:space="preserve"> PAGEREF _Toc89005343 \h </w:instrText>
+              <w:instrText xml:space="preserve"> PAGEREF _Toc89015196 \h </w:instrText>
             </w:r>
             <w:r>
               <w:rPr>
@@ -860,7 +860,7 @@
               <w:lang w:val="vi-VN" w:eastAsia="vi-VN"/>
             </w:rPr>
           </w:pPr>
-          <w:hyperlink w:anchor="_Toc89005344" w:history="1">
+          <w:hyperlink w:anchor="_Toc89015197" w:history="1">
             <w:r>
               <w:rPr>
                 <w:rStyle w:val="Hyperlink"/>
@@ -904,7 +904,7 @@
                 <w:noProof/>
                 <w:webHidden/>
               </w:rPr>
-              <w:instrText xml:space="preserve"> PAGEREF _Toc89005344 \h </w:instrText>
+              <w:instrText xml:space="preserve"> PAGEREF _Toc89015197 \h </w:instrText>
             </w:r>
             <w:r>
               <w:rPr>
@@ -949,7 +949,7 @@
               <w:lang w:val="vi-VN" w:eastAsia="vi-VN"/>
             </w:rPr>
           </w:pPr>
-          <w:hyperlink w:anchor="_Toc89005345" w:history="1">
+          <w:hyperlink w:anchor="_Toc89015198" w:history="1">
             <w:r>
               <w:rPr>
                 <w:rStyle w:val="Hyperlink"/>
@@ -993,7 +993,7 @@
                 <w:noProof/>
                 <w:webHidden/>
               </w:rPr>
-              <w:instrText xml:space="preserve"> PAGEREF _Toc89005345 \h </w:instrText>
+              <w:instrText xml:space="preserve"> PAGEREF _Toc89015198 \h </w:instrText>
             </w:r>
             <w:r>
               <w:rPr>
@@ -1038,7 +1038,7 @@
               <w:lang w:val="vi-VN" w:eastAsia="vi-VN"/>
             </w:rPr>
           </w:pPr>
-          <w:hyperlink w:anchor="_Toc89005346" w:history="1">
+          <w:hyperlink w:anchor="_Toc89015199" w:history="1">
             <w:r>
               <w:rPr>
                 <w:rStyle w:val="Hyperlink"/>
@@ -1082,7 +1082,7 @@
                 <w:noProof/>
                 <w:webHidden/>
               </w:rPr>
-              <w:instrText xml:space="preserve"> PAGEREF _Toc89005346 \h </w:instrText>
+              <w:instrText xml:space="preserve"> PAGEREF _Toc89015199 \h </w:instrText>
             </w:r>
             <w:r>
               <w:rPr>
@@ -1127,7 +1127,7 @@
               <w:lang w:eastAsia="vi-VN"/>
             </w:rPr>
           </w:pPr>
-          <w:hyperlink w:anchor="_Toc89005347" w:history="1">
+          <w:hyperlink w:anchor="_Toc89015200" w:history="1">
             <w:r>
               <w:rPr>
                 <w:rStyle w:val="Hyperlink"/>
@@ -1170,7 +1170,7 @@
                 <w:noProof/>
                 <w:webHidden/>
               </w:rPr>
-              <w:instrText xml:space="preserve"> PAGEREF _Toc89005347 \h </w:instrText>
+              <w:instrText xml:space="preserve"> PAGEREF _Toc89015200 \h </w:instrText>
             </w:r>
             <w:r>
               <w:rPr>
@@ -1215,7 +1215,7 @@
               <w:lang w:eastAsia="vi-VN"/>
             </w:rPr>
           </w:pPr>
-          <w:hyperlink w:anchor="_Toc89005348" w:history="1">
+          <w:hyperlink w:anchor="_Toc89015201" w:history="1">
             <w:r>
               <w:rPr>
                 <w:rStyle w:val="Hyperlink"/>
@@ -1258,7 +1258,7 @@
                 <w:noProof/>
                 <w:webHidden/>
               </w:rPr>
-              <w:instrText xml:space="preserve"> PAGEREF _Toc89005348 \h </w:instrText>
+              <w:instrText xml:space="preserve"> PAGEREF _Toc89015201 \h </w:instrText>
             </w:r>
             <w:r>
               <w:rPr>
@@ -1303,7 +1303,7 @@
               <w:lang w:eastAsia="vi-VN"/>
             </w:rPr>
           </w:pPr>
-          <w:hyperlink w:anchor="_Toc89005349" w:history="1">
+          <w:hyperlink w:anchor="_Toc89015202" w:history="1">
             <w:r>
               <w:rPr>
                 <w:rStyle w:val="Hyperlink"/>
@@ -1346,7 +1346,7 @@
                 <w:noProof/>
                 <w:webHidden/>
               </w:rPr>
-              <w:instrText xml:space="preserve"> PAGEREF _Toc89005349 \h </w:instrText>
+              <w:instrText xml:space="preserve"> PAGEREF _Toc89015202 \h </w:instrText>
             </w:r>
             <w:r>
               <w:rPr>
@@ -1391,7 +1391,7 @@
               <w:lang w:eastAsia="vi-VN"/>
             </w:rPr>
           </w:pPr>
-          <w:hyperlink w:anchor="_Toc89005350" w:history="1">
+          <w:hyperlink w:anchor="_Toc89015203" w:history="1">
             <w:r>
               <w:rPr>
                 <w:rStyle w:val="Hyperlink"/>
@@ -1434,7 +1434,7 @@
                 <w:noProof/>
                 <w:webHidden/>
               </w:rPr>
-              <w:instrText xml:space="preserve"> PAGEREF _Toc89005350 \h </w:instrText>
+              <w:instrText xml:space="preserve"> PAGEREF _Toc89015203 \h </w:instrText>
             </w:r>
             <w:r>
               <w:rPr>
@@ -1479,7 +1479,7 @@
               <w:lang w:eastAsia="vi-VN"/>
             </w:rPr>
           </w:pPr>
-          <w:hyperlink w:anchor="_Toc89005351" w:history="1">
+          <w:hyperlink w:anchor="_Toc89015204" w:history="1">
             <w:r>
               <w:rPr>
                 <w:rStyle w:val="Hyperlink"/>
@@ -1522,7 +1522,7 @@
                 <w:noProof/>
                 <w:webHidden/>
               </w:rPr>
-              <w:instrText xml:space="preserve"> PAGEREF _Toc89005351 \h </w:instrText>
+              <w:instrText xml:space="preserve"> PAGEREF _Toc89015204 \h </w:instrText>
             </w:r>
             <w:r>
               <w:rPr>
@@ -1567,7 +1567,7 @@
               <w:lang w:eastAsia="vi-VN"/>
             </w:rPr>
           </w:pPr>
-          <w:hyperlink w:anchor="_Toc89005352" w:history="1">
+          <w:hyperlink w:anchor="_Toc89015205" w:history="1">
             <w:r>
               <w:rPr>
                 <w:rStyle w:val="Hyperlink"/>
@@ -1610,7 +1610,7 @@
                 <w:noProof/>
                 <w:webHidden/>
               </w:rPr>
-              <w:instrText xml:space="preserve"> PAGEREF _Toc89005352 \h </w:instrText>
+              <w:instrText xml:space="preserve"> PAGEREF _Toc89015205 \h </w:instrText>
             </w:r>
             <w:r>
               <w:rPr>
@@ -1655,7 +1655,7 @@
               <w:lang w:val="vi-VN" w:eastAsia="vi-VN"/>
             </w:rPr>
           </w:pPr>
-          <w:hyperlink w:anchor="_Toc89005353" w:history="1">
+          <w:hyperlink w:anchor="_Toc89015206" w:history="1">
             <w:r>
               <w:rPr>
                 <w:rStyle w:val="Hyperlink"/>
@@ -1699,7 +1699,7 @@
                 <w:noProof/>
                 <w:webHidden/>
               </w:rPr>
-              <w:instrText xml:space="preserve"> PAGEREF _Toc89005353 \h </w:instrText>
+              <w:instrText xml:space="preserve"> PAGEREF _Toc89015206 \h </w:instrText>
             </w:r>
             <w:r>
               <w:rPr>
@@ -1829,7 +1829,7 @@
         </w:rPr>
         <w:fldChar w:fldCharType="separate"/>
       </w:r>
-      <w:hyperlink w:anchor="_Toc89005355" w:history="1">
+      <w:hyperlink w:anchor="_Toc89015207" w:history="1">
         <w:r>
           <w:rPr>
             <w:rStyle w:val="Hyperlink"/>
@@ -1856,7 +1856,7 @@
             <w:noProof/>
             <w:webHidden/>
           </w:rPr>
-          <w:instrText xml:space="preserve"> PAGEREF _Toc89005355 \h </w:instrText>
+          <w:instrText xml:space="preserve"> PAGEREF _Toc89015207 \h </w:instrText>
         </w:r>
         <w:r>
           <w:rPr>
@@ -1972,7 +1972,7 @@
         </w:rPr>
         <w:fldChar w:fldCharType="separate"/>
       </w:r>
-      <w:hyperlink w:anchor="_Toc89005356" w:history="1">
+      <w:hyperlink w:anchor="_Toc89015208" w:history="1">
         <w:r>
           <w:rPr>
             <w:rStyle w:val="Hyperlink"/>
@@ -2000,7 +2000,7 @@
             <w:noProof/>
             <w:webHidden/>
           </w:rPr>
-          <w:instrText xml:space="preserve"> PAGEREF _Toc89005356 \h </w:instrText>
+          <w:instrText xml:space="preserve"> PAGEREF _Toc89015208 \h </w:instrText>
         </w:r>
         <w:r>
           <w:rPr>
@@ -2055,7 +2055,7 @@
         </w:rPr>
         <w:br w:type="page"/>
       </w:r>
-      <w:bookmarkStart w:id="6" w:name="_Toc89005341"/>
+      <w:bookmarkStart w:id="6" w:name="_Toc89015194"/>
       <w:r>
         <w:rPr>
           <w:noProof/>
@@ -2094,7 +2094,7 @@
           <w:noProof/>
         </w:rPr>
       </w:pPr>
-      <w:bookmarkStart w:id="9" w:name="_Toc89005342"/>
+      <w:bookmarkStart w:id="9" w:name="_Toc89015195"/>
       <w:r>
         <w:rPr>
           <w:noProof/>
@@ -2145,7 +2145,7 @@
           <w:noProof/>
         </w:rPr>
       </w:pPr>
-      <w:bookmarkStart w:id="10" w:name="_Toc89005343"/>
+      <w:bookmarkStart w:id="10" w:name="_Toc89015196"/>
       <w:r>
         <w:rPr>
           <w:noProof/>
@@ -2180,7 +2180,7 @@
           <w:noProof/>
         </w:rPr>
       </w:pPr>
-      <w:bookmarkStart w:id="11" w:name="_Toc89005344"/>
+      <w:bookmarkStart w:id="11" w:name="_Toc89015197"/>
       <w:r>
         <w:rPr>
           <w:noProof/>
@@ -2215,7 +2215,7 @@
           <w:noProof/>
         </w:rPr>
       </w:pPr>
-      <w:bookmarkStart w:id="12" w:name="_Toc89005345"/>
+      <w:bookmarkStart w:id="12" w:name="_Toc89015198"/>
       <w:r>
         <w:rPr>
           <w:noProof/>
@@ -2254,7 +2254,7 @@
           <w:noProof/>
         </w:rPr>
       </w:pPr>
-      <w:bookmarkStart w:id="13" w:name="_Toc89005346"/>
+      <w:bookmarkStart w:id="13" w:name="_Toc89015199"/>
       <w:r>
         <w:rPr>
           <w:noProof/>
@@ -2272,7 +2272,7 @@
           <w:noProof/>
         </w:rPr>
       </w:pPr>
-      <w:bookmarkStart w:id="14" w:name="_Toc89005347"/>
+      <w:bookmarkStart w:id="14" w:name="_Toc89015200"/>
       <w:r>
         <w:rPr>
           <w:noProof/>
@@ -2288,7 +2288,7 @@
           <w:noProof/>
         </w:rPr>
       </w:pPr>
-      <w:bookmarkStart w:id="15" w:name="_Toc89005348"/>
+      <w:bookmarkStart w:id="15" w:name="_Toc89015201"/>
       <w:r>
         <w:rPr>
           <w:noProof/>
@@ -2335,10 +2335,10 @@
           <w:lang w:val="en-US"/>
         </w:rPr>
         <w:drawing>
-          <wp:inline distT="0" distB="0" distL="0" distR="0" wp14:anchorId="21701810" wp14:editId="47326A6D">
-            <wp:extent cx="5756275" cy="4994275"/>
+          <wp:inline distT="0" distB="0" distL="0" distR="0" wp14:anchorId="2D1673F8" wp14:editId="33B41E24">
+            <wp:extent cx="5677042" cy="5194300"/>
             <wp:effectExtent l="0" t="0" r="0" b="0"/>
-            <wp:docPr id="2" name="Picture 2"/>
+            <wp:docPr id="1" name="Picture 1"/>
             <wp:cNvGraphicFramePr>
               <a:graphicFrameLocks xmlns:a="http://schemas.openxmlformats.org/drawingml/2006/main" noChangeAspect="1"/>
             </wp:cNvGraphicFramePr>
@@ -2351,7 +2351,7 @@
                       <a:picLocks noChangeAspect="1" noChangeArrowheads="1"/>
                     </pic:cNvPicPr>
                   </pic:nvPicPr>
-                  <pic:blipFill>
+                  <pic:blipFill rotWithShape="1">
                     <a:blip r:embed="rId10" cstate="print">
                       <a:extLst>
                         <a:ext uri="{28A0092B-C50C-407E-A947-70E740481C1C}">
@@ -2359,15 +2359,13 @@
                         </a:ext>
                       </a:extLst>
                     </a:blip>
-                    <a:srcRect/>
-                    <a:stretch>
-                      <a:fillRect/>
-                    </a:stretch>
+                    <a:srcRect r="2542"/>
+                    <a:stretch/>
                   </pic:blipFill>
                   <pic:spPr bwMode="auto">
                     <a:xfrm>
                       <a:off x="0" y="0"/>
-                      <a:ext cx="5756275" cy="4994275"/>
+                      <a:ext cx="5678335" cy="5195483"/>
                     </a:xfrm>
                     <a:prstGeom prst="rect">
                       <a:avLst/>
@@ -2376,6 +2374,11 @@
                     <a:ln>
                       <a:noFill/>
                     </a:ln>
+                    <a:extLst>
+                      <a:ext uri="{53640926-AAD7-44D8-BBD7-CCE9431645EC}">
+                        <a14:shadowObscured xmlns:a14="http://schemas.microsoft.com/office/drawing/2010/main"/>
+                      </a:ext>
+                    </a:extLst>
                   </pic:spPr>
                 </pic:pic>
               </a:graphicData>
@@ -2388,29 +2391,55 @@
       <w:pPr>
         <w:pStyle w:val="Caption"/>
       </w:pPr>
-      <w:bookmarkStart w:id="16" w:name="_Toc89005355"/>
+      <w:bookmarkStart w:id="16" w:name="_Toc89015207"/>
       <w:r>
         <w:t xml:space="preserve">Hình </w:t>
       </w:r>
-      <w:fldSimple w:instr=" STYLEREF 1 \s ">
-        <w:r>
-          <w:rPr>
-            <w:noProof/>
-          </w:rPr>
-          <w:t>6</w:t>
-        </w:r>
-      </w:fldSimple>
+      <w:r>
+        <w:fldChar w:fldCharType="begin"/>
+      </w:r>
+      <w:r>
+        <w:instrText xml:space="preserve"> STYLEREF 1 \s </w:instrText>
+      </w:r>
+      <w:r>
+        <w:fldChar w:fldCharType="separate"/>
+      </w:r>
+      <w:r>
+        <w:rPr>
+          <w:noProof/>
+        </w:rPr>
+        <w:t>6</w:t>
+      </w:r>
+      <w:r>
+        <w:rPr>
+          <w:noProof/>
+        </w:rPr>
+        <w:fldChar w:fldCharType="end"/>
+      </w:r>
       <w:r>
         <w:t>.</w:t>
       </w:r>
-      <w:fldSimple w:instr=" SEQ Hình \* ARABIC \s 1 ">
-        <w:r>
-          <w:rPr>
-            <w:noProof/>
-          </w:rPr>
-          <w:t>1</w:t>
-        </w:r>
-      </w:fldSimple>
+      <w:r>
+        <w:fldChar w:fldCharType="begin"/>
+      </w:r>
+      <w:r>
+        <w:instrText xml:space="preserve"> SEQ Hình \* ARABIC \s 1 </w:instrText>
+      </w:r>
+      <w:r>
+        <w:fldChar w:fldCharType="separate"/>
+      </w:r>
+      <w:r>
+        <w:rPr>
+          <w:noProof/>
+        </w:rPr>
+        <w:t>1</w:t>
+      </w:r>
+      <w:r>
+        <w:rPr>
+          <w:noProof/>
+        </w:rPr>
+        <w:fldChar w:fldCharType="end"/>
+      </w:r>
       <w:r>
         <w:rPr>
           <w:noProof/>
@@ -2629,6 +2658,7 @@
                 <w:szCs w:val="26"/>
                 <w:lang w:val="en-US"/>
               </w:rPr>
+              <w:lastRenderedPageBreak/>
               <w:t>Actor chính</w:t>
             </w:r>
           </w:p>
@@ -2679,7 +2709,6 @@
                 <w:szCs w:val="26"/>
                 <w:lang w:val="en-US"/>
               </w:rPr>
-              <w:lastRenderedPageBreak/>
               <w:t>Actor phụ</w:t>
             </w:r>
           </w:p>
@@ -3259,7 +3288,7 @@
           <w:rFonts w:cs="Times New Roman"/>
         </w:rPr>
       </w:pPr>
-      <w:bookmarkStart w:id="17" w:name="_Toc89005356"/>
+      <w:bookmarkStart w:id="17" w:name="_Toc89015208"/>
       <w:r>
         <w:rPr>
           <w:rFonts w:cs="Times New Roman"/>
@@ -3349,7 +3378,7 @@
           <w:noProof/>
         </w:rPr>
       </w:pPr>
-      <w:bookmarkStart w:id="18" w:name="_Toc89005349"/>
+      <w:bookmarkStart w:id="18" w:name="_Toc89015202"/>
       <w:r>
         <w:rPr>
           <w:noProof/>
@@ -3362,7 +3391,7 @@
       <w:pPr>
         <w:pStyle w:val="Heading3"/>
       </w:pPr>
-      <w:bookmarkStart w:id="19" w:name="_Toc89005350"/>
+      <w:bookmarkStart w:id="19" w:name="_Toc89015203"/>
       <w:r>
         <w:t>Sơ đồ tuần tự (Sequence Diagram)</w:t>
       </w:r>
@@ -3376,7 +3405,7 @@
           <w:noProof/>
         </w:rPr>
       </w:pPr>
-      <w:bookmarkStart w:id="20" w:name="_Toc89005351"/>
+      <w:bookmarkStart w:id="20" w:name="_Toc89015204"/>
       <w:r>
         <w:rPr>
           <w:noProof/>
@@ -3392,7 +3421,7 @@
           <w:noProof/>
         </w:rPr>
       </w:pPr>
-      <w:bookmarkStart w:id="21" w:name="_Toc89005352"/>
+      <w:bookmarkStart w:id="21" w:name="_Toc89015205"/>
       <w:r>
         <w:rPr>
           <w:noProof/>
@@ -3408,7 +3437,7 @@
           <w:noProof/>
         </w:rPr>
       </w:pPr>
-      <w:bookmarkStart w:id="22" w:name="_Toc89005353"/>
+      <w:bookmarkStart w:id="22" w:name="_Toc89015206"/>
       <w:r>
         <w:rPr>
           <w:noProof/>

</xml_diff>

<commit_message>
update introduction for the report
</commit_message>
<xml_diff>
--- a/bai-tap/bai-tap-nhom/Bài tập nhóm - Quản lý nhà sách/Báo cáo Bài tập nhóm - Quản lý nhà sách.docx
+++ b/bai-tap/bai-tap-nhom/Bài tập nhóm - Quản lý nhà sách/Báo cáo Bài tập nhóm - Quản lý nhà sách.docx
@@ -13,8 +13,8 @@
           <w:szCs w:val="26"/>
         </w:rPr>
       </w:pPr>
-      <w:bookmarkStart w:id="0" w:name="_Toc51060025"/>
-      <w:bookmarkStart w:id="1" w:name="_Toc51061469"/>
+      <w:bookmarkStart w:id="0" w:name="_Toc51061469"/>
+      <w:bookmarkStart w:id="1" w:name="_Toc51060025"/>
       <w:r>
         <w:rPr>
           <w:rFonts w:cs="Times New Roman"/>
@@ -2472,23 +2472,7 @@
           <w:noProof/>
           <w:lang w:val="en-US"/>
         </w:rPr>
-        <w:t xml:space="preserve"> trở nên dễ dàng hơn bao giờ hết khi người học có thể thoải mái lựa chọn hình thức học mà bản thân cảm thấy </w:t>
-      </w:r>
-      <w:r>
-        <w:rPr>
-          <w:rFonts w:cs="Times New Roman"/>
-          <w:noProof/>
-          <w:lang w:val="en-US"/>
-        </w:rPr>
-        <w:t xml:space="preserve">phù hợp </w:t>
-      </w:r>
-      <w:r>
-        <w:rPr>
-          <w:rFonts w:cs="Times New Roman"/>
-          <w:noProof/>
-          <w:lang w:val="en-US"/>
-        </w:rPr>
-        <w:t xml:space="preserve">và thoải mái nhất. </w:t>
+        <w:t xml:space="preserve"> trở nên dễ dàng hơn bao giờ hết khi người học có thể thoải mái lựa chọn hình thức học mà bản thân cảm thấy phù hợp và thoải mái nhất. </w:t>
       </w:r>
       <w:r>
         <w:rPr>
@@ -2542,23 +2526,191 @@
           <w:noProof/>
           <w:lang w:val="en-US"/>
         </w:rPr>
-        <w:t xml:space="preserve"> video trên các </w:t>
-      </w:r>
-      <w:r>
-        <w:rPr>
-          <w:rFonts w:cs="Times New Roman"/>
-          <w:noProof/>
-          <w:lang w:val="en-US"/>
-        </w:rPr>
-        <w:t>nền tảng học tập trực tuyến</w:t>
-      </w:r>
-      <w:r>
-        <w:rPr>
-          <w:rFonts w:cs="Times New Roman"/>
-          <w:noProof/>
-          <w:lang w:val="en-US"/>
-        </w:rPr>
-        <w:t>, và đặc biệt không thể không nhắc đến việc tự học thông qua sách.</w:t>
+        <w:t xml:space="preserve"> video trên các nền tảng học tập trực tuyến, và đặc biệt không thể không nhắc đến việc tự học thông qua sách.</w:t>
+      </w:r>
+      <w:r>
+        <w:rPr>
+          <w:rFonts w:cs="Times New Roman"/>
+          <w:noProof/>
+          <w:lang w:val="en-US"/>
+        </w:rPr>
+        <w:t xml:space="preserve"> Có rất nhiều ưu điểm của việc đọc sách</w:t>
+      </w:r>
+      <w:r>
+        <w:rPr>
+          <w:rFonts w:cs="Times New Roman"/>
+          <w:noProof/>
+          <w:lang w:val="en-US"/>
+        </w:rPr>
+        <w:t xml:space="preserve"> khiến cho dù cuộc sống có hiện đại đến mấy cũng không thể làm mai một đi văn hoá đọc. </w:t>
+      </w:r>
+      <w:r>
+        <w:rPr>
+          <w:rFonts w:cs="Times New Roman"/>
+          <w:noProof/>
+          <w:lang w:val="en-US"/>
+        </w:rPr>
+        <w:t>Các nghiên cứu đã chỉ ra rằng bộ não con người</w:t>
+      </w:r>
+      <w:r>
+        <w:rPr>
+          <w:rFonts w:cs="Times New Roman"/>
+          <w:noProof/>
+          <w:lang w:val="en-US"/>
+        </w:rPr>
+        <w:t xml:space="preserve"> sẽ</w:t>
+      </w:r>
+      <w:r>
+        <w:rPr>
+          <w:rFonts w:cs="Times New Roman"/>
+          <w:noProof/>
+          <w:lang w:val="en-US"/>
+        </w:rPr>
+        <w:t xml:space="preserve"> lưu giữ</w:t>
+      </w:r>
+      <w:r>
+        <w:rPr>
+          <w:rFonts w:cs="Times New Roman"/>
+          <w:noProof/>
+          <w:lang w:val="en-US"/>
+        </w:rPr>
+        <w:t xml:space="preserve"> được</w:t>
+      </w:r>
+      <w:r>
+        <w:rPr>
+          <w:rFonts w:cs="Times New Roman"/>
+          <w:noProof/>
+          <w:lang w:val="en-US"/>
+        </w:rPr>
+        <w:t xml:space="preserve"> nhiều thông tin hơn khi</w:t>
+      </w:r>
+      <w:r>
+        <w:rPr>
+          <w:rFonts w:cs="Times New Roman"/>
+          <w:noProof/>
+          <w:lang w:val="en-US"/>
+        </w:rPr>
+        <w:t xml:space="preserve"> </w:t>
+      </w:r>
+      <w:r>
+        <w:rPr>
+          <w:rFonts w:cs="Times New Roman"/>
+          <w:noProof/>
+          <w:lang w:val="en-US"/>
+        </w:rPr>
+        <w:t>chủ động</w:t>
+      </w:r>
+      <w:r>
+        <w:rPr>
+          <w:rFonts w:cs="Times New Roman"/>
+          <w:noProof/>
+          <w:lang w:val="en-US"/>
+        </w:rPr>
+        <w:t xml:space="preserve"> </w:t>
+      </w:r>
+      <w:r>
+        <w:rPr>
+          <w:rFonts w:cs="Times New Roman"/>
+          <w:noProof/>
+          <w:lang w:val="en-US"/>
+        </w:rPr>
+        <w:t xml:space="preserve">tiếp </w:t>
+      </w:r>
+      <w:r>
+        <w:rPr>
+          <w:rFonts w:cs="Times New Roman"/>
+          <w:noProof/>
+          <w:lang w:val="en-US"/>
+        </w:rPr>
+        <w:t>thu</w:t>
+      </w:r>
+      <w:r>
+        <w:rPr>
+          <w:rFonts w:cs="Times New Roman"/>
+          <w:noProof/>
+          <w:lang w:val="en-US"/>
+        </w:rPr>
+        <w:t xml:space="preserve"> kiến thức</w:t>
+      </w:r>
+      <w:r>
+        <w:rPr>
+          <w:rFonts w:cs="Times New Roman"/>
+          <w:noProof/>
+          <w:lang w:val="en-US"/>
+        </w:rPr>
+        <w:t xml:space="preserve"> </w:t>
+      </w:r>
+      <w:r>
+        <w:rPr>
+          <w:rFonts w:cs="Times New Roman"/>
+          <w:noProof/>
+          <w:lang w:val="en-US"/>
+        </w:rPr>
+        <w:t>và tích luỹ nó</w:t>
+      </w:r>
+      <w:r>
+        <w:rPr>
+          <w:rFonts w:cs="Times New Roman"/>
+          <w:noProof/>
+          <w:lang w:val="en-US"/>
+        </w:rPr>
+        <w:t xml:space="preserve"> trong một thời gian dài</w:t>
+      </w:r>
+      <w:r>
+        <w:rPr>
+          <w:rFonts w:cs="Times New Roman"/>
+          <w:noProof/>
+          <w:lang w:val="en-US"/>
+        </w:rPr>
+        <w:t>,</w:t>
+      </w:r>
+      <w:r>
+        <w:rPr>
+          <w:rFonts w:cs="Times New Roman"/>
+          <w:noProof/>
+          <w:lang w:val="en-US"/>
+        </w:rPr>
+        <w:t xml:space="preserve"> </w:t>
+      </w:r>
+      <w:r>
+        <w:rPr>
+          <w:rFonts w:cs="Times New Roman"/>
+          <w:noProof/>
+          <w:lang w:val="en-US"/>
+        </w:rPr>
+        <w:t>và việc đ</w:t>
+      </w:r>
+      <w:r>
+        <w:rPr>
+          <w:rFonts w:cs="Times New Roman"/>
+          <w:noProof/>
+          <w:lang w:val="en-US"/>
+        </w:rPr>
+        <w:t>ọc</w:t>
+      </w:r>
+      <w:r>
+        <w:rPr>
+          <w:rFonts w:cs="Times New Roman"/>
+          <w:noProof/>
+          <w:lang w:val="en-US"/>
+        </w:rPr>
+        <w:t xml:space="preserve"> sách</w:t>
+      </w:r>
+      <w:r>
+        <w:rPr>
+          <w:rFonts w:cs="Times New Roman"/>
+          <w:noProof/>
+          <w:lang w:val="en-US"/>
+        </w:rPr>
+        <w:t xml:space="preserve"> là một </w:t>
+      </w:r>
+      <w:r>
+        <w:rPr>
+          <w:rFonts w:cs="Times New Roman"/>
+          <w:noProof/>
+          <w:lang w:val="en-US"/>
+        </w:rPr>
+        <w:t>quá trình như vậy.</w:t>
       </w:r>
     </w:p>
     <w:p>
@@ -2608,7 +2760,6 @@
         <w:rPr>
           <w:rFonts w:cs="Times New Roman"/>
           <w:noProof/>
-          <w:lang/>
         </w:rPr>
         <w:t>thì</w:t>
       </w:r>
@@ -2626,7 +2777,23 @@
           <w:noProof/>
           <w:lang w:val="en-US"/>
         </w:rPr>
-        <w:t xml:space="preserve"> năm và số lần tái bản</w:t>
+        <w:t xml:space="preserve"> năm</w:t>
+      </w:r>
+      <w:r>
+        <w:rPr>
+          <w:rFonts w:cs="Times New Roman"/>
+          <w:noProof/>
+          <w:lang w:val="en-US"/>
+        </w:rPr>
+        <w:t xml:space="preserve"> xuất bản</w:t>
+      </w:r>
+      <w:r>
+        <w:rPr>
+          <w:rFonts w:cs="Times New Roman"/>
+          <w:noProof/>
+          <w:lang w:val="en-US"/>
+        </w:rPr>
+        <w:t xml:space="preserve"> và số lần tái bản</w:t>
       </w:r>
       <w:r>
         <w:rPr>
@@ -2658,7 +2825,55 @@
           <w:noProof/>
           <w:lang w:val="en-US"/>
         </w:rPr>
-        <w:t xml:space="preserve"> đầy đủ, khách hàng hoàn toàn có thể tự </w:t>
+        <w:t xml:space="preserve"> đầy đủ,</w:t>
+      </w:r>
+      <w:r>
+        <w:rPr>
+          <w:rFonts w:cs="Times New Roman"/>
+          <w:noProof/>
+          <w:lang w:val="en-US"/>
+        </w:rPr>
+        <w:t xml:space="preserve"> những</w:t>
+      </w:r>
+      <w:r>
+        <w:rPr>
+          <w:rFonts w:cs="Times New Roman"/>
+          <w:noProof/>
+          <w:lang w:val="en-US"/>
+        </w:rPr>
+        <w:t xml:space="preserve"> </w:t>
+      </w:r>
+      <w:r>
+        <w:rPr>
+          <w:rFonts w:cs="Times New Roman"/>
+          <w:noProof/>
+          <w:lang w:val="en-US"/>
+        </w:rPr>
+        <w:t>độc giả</w:t>
+      </w:r>
+      <w:r>
+        <w:rPr>
+          <w:rFonts w:cs="Times New Roman"/>
+          <w:noProof/>
+          <w:lang w:val="en-US"/>
+        </w:rPr>
+        <w:t xml:space="preserve"> </w:t>
+      </w:r>
+      <w:r>
+        <w:rPr>
+          <w:rFonts w:cs="Times New Roman"/>
+          <w:noProof/>
+          <w:lang w:val="en-US"/>
+        </w:rPr>
+        <w:t xml:space="preserve">yêu sách </w:t>
+      </w:r>
+      <w:r>
+        <w:rPr>
+          <w:rFonts w:cs="Times New Roman"/>
+          <w:noProof/>
+          <w:lang w:val="en-US"/>
+        </w:rPr>
+        <w:t xml:space="preserve">hoàn toàn có thể tự </w:t>
       </w:r>
       <w:r>
         <w:rPr>
@@ -2674,7 +2889,111 @@
           <w:noProof/>
           <w:lang w:val="en-US"/>
         </w:rPr>
-        <w:t xml:space="preserve"> và chọn lựa những quyển sách phù hợp với nhu cầu của mình. Hơn nữa, khách hàng còn có thể tìm đọc nội dung chính, cũng như các bài viết đánh giá trên các website, diễn đàn để tham khảo, từ đó rút ngắn thời gian lựa chọn sản phẩm, thực hiện thanh toán nhanh chóng, tiện lợi</w:t>
+        <w:t xml:space="preserve"> thông tin</w:t>
+      </w:r>
+      <w:r>
+        <w:rPr>
+          <w:rFonts w:cs="Times New Roman"/>
+          <w:noProof/>
+          <w:lang w:val="en-US"/>
+        </w:rPr>
+        <w:t xml:space="preserve"> và chọn lựa những </w:t>
+      </w:r>
+      <w:r>
+        <w:rPr>
+          <w:rFonts w:cs="Times New Roman"/>
+          <w:noProof/>
+          <w:lang w:val="en-US"/>
+        </w:rPr>
+        <w:t>đầu</w:t>
+      </w:r>
+      <w:r>
+        <w:rPr>
+          <w:rFonts w:cs="Times New Roman"/>
+          <w:noProof/>
+          <w:lang w:val="en-US"/>
+        </w:rPr>
+        <w:t xml:space="preserve"> sách phù hợp với nhu cầu của mình. Hơn nữa, </w:t>
+      </w:r>
+      <w:r>
+        <w:rPr>
+          <w:rFonts w:cs="Times New Roman"/>
+          <w:noProof/>
+          <w:lang w:val="en-US"/>
+        </w:rPr>
+        <w:t>độc giả</w:t>
+      </w:r>
+      <w:r>
+        <w:rPr>
+          <w:rFonts w:cs="Times New Roman"/>
+          <w:noProof/>
+          <w:lang w:val="en-US"/>
+        </w:rPr>
+        <w:t xml:space="preserve"> còn có thể tìm đọc</w:t>
+      </w:r>
+      <w:r>
+        <w:rPr>
+          <w:rFonts w:cs="Times New Roman"/>
+          <w:noProof/>
+          <w:lang w:val="en-US"/>
+        </w:rPr>
+        <w:t xml:space="preserve"> các</w:t>
+      </w:r>
+      <w:r>
+        <w:rPr>
+          <w:rFonts w:cs="Times New Roman"/>
+          <w:noProof/>
+          <w:lang w:val="en-US"/>
+        </w:rPr>
+        <w:t xml:space="preserve"> bài</w:t>
+      </w:r>
+      <w:r>
+        <w:rPr>
+          <w:rFonts w:cs="Times New Roman"/>
+          <w:noProof/>
+          <w:lang w:val="en-US"/>
+        </w:rPr>
+        <w:t xml:space="preserve"> tóm tắt</w:t>
+      </w:r>
+      <w:r>
+        <w:rPr>
+          <w:rFonts w:cs="Times New Roman"/>
+          <w:noProof/>
+          <w:lang w:val="en-US"/>
+        </w:rPr>
+        <w:t xml:space="preserve"> nội dung chính, cũng như </w:t>
+      </w:r>
+      <w:r>
+        <w:rPr>
+          <w:rFonts w:cs="Times New Roman"/>
+          <w:noProof/>
+          <w:lang w:val="en-US"/>
+        </w:rPr>
+        <w:t xml:space="preserve">đọc </w:t>
+      </w:r>
+      <w:r>
+        <w:rPr>
+          <w:rFonts w:cs="Times New Roman"/>
+          <w:noProof/>
+          <w:lang w:val="en-US"/>
+        </w:rPr>
+        <w:t>các bài viết đánh giá trên các website, diễn đàn để tham khảo, từ đó rút ngắn thời gian lựa chọn sản phẩm</w:t>
+      </w:r>
+      <w:r>
+        <w:rPr>
+          <w:rFonts w:cs="Times New Roman"/>
+          <w:noProof/>
+          <w:lang w:val="en-US"/>
+        </w:rPr>
+        <w:t xml:space="preserve"> và</w:t>
+      </w:r>
+      <w:r>
+        <w:rPr>
+          <w:rFonts w:cs="Times New Roman"/>
+          <w:noProof/>
+          <w:lang w:val="en-US"/>
+        </w:rPr>
+        <w:t xml:space="preserve"> thực hiện thanh toán nhanh chóng, tiện lợi</w:t>
       </w:r>
       <w:r>
         <w:rPr>
@@ -2697,6 +3016,7 @@
         <w:rPr>
           <w:noProof/>
         </w:rPr>
+        <w:lastRenderedPageBreak/>
         <w:t>GIỚI THI</w:t>
       </w:r>
       <w:r>
@@ -2749,7 +3069,6 @@
         <w:rPr>
           <w:noProof/>
         </w:rPr>
-        <w:lastRenderedPageBreak/>
         <w:t>ĐỊNH NGHĨA CÁC YÊU CẦU NGƯỜI DÙNG</w:t>
       </w:r>
       <w:bookmarkEnd w:id="10"/>
@@ -2843,6 +3162,14 @@
           <w:lang w:val="en-US"/>
         </w:rPr>
         <w:t>Đề bài yêu cầu của thầy + Functional &amp; Non-functional requirement</w:t>
+      </w:r>
+      <w:r>
+        <w:rPr>
+          <w:rFonts w:cs="Times New Roman"/>
+          <w:noProof/>
+          <w:lang w:val="en-US"/>
+        </w:rPr>
+        <w:t>s</w:t>
       </w:r>
       <w:r>
         <w:rPr>

</xml_diff>

<commit_message>
update group homework report
</commit_message>
<xml_diff>
--- a/bai-tap/bai-tap-nhom/Bài tập nhóm - Quản lý nhà sách/Báo cáo Bài tập nhóm - Quản lý nhà sách.docx
+++ b/bai-tap/bai-tap-nhom/Bài tập nhóm - Quản lý nhà sách/Báo cáo Bài tập nhóm - Quản lý nhà sách.docx
@@ -13,10 +13,10 @@
           <w:szCs w:val="26"/>
         </w:rPr>
       </w:pPr>
-      <w:bookmarkStart w:id="0" w:name="_Toc51060025"/>
+      <w:bookmarkStart w:id="0" w:name="_Hlk93040589"/>
       <w:bookmarkStart w:id="1" w:name="_Toc51061469"/>
-      <w:bookmarkStart w:id="2" w:name="_Hlk93040589"/>
-      <w:bookmarkEnd w:id="2"/>
+      <w:bookmarkStart w:id="2" w:name="_Toc51060025"/>
+      <w:bookmarkEnd w:id="0"/>
       <w:r>
         <w:rPr>
           <w:rFonts w:cs="Times New Roman"/>
@@ -525,8 +525,8 @@
         <w:t xml:space="preserve"> </w:t>
       </w:r>
     </w:p>
+    <w:bookmarkEnd w:id="2" w:displacedByCustomXml="next"/>
     <w:bookmarkEnd w:id="1" w:displacedByCustomXml="next"/>
-    <w:bookmarkEnd w:id="0" w:displacedByCustomXml="next"/>
     <w:bookmarkStart w:id="3" w:name="_Toc49105236" w:displacedByCustomXml="next"/>
     <w:sdt>
       <w:sdtPr>
@@ -6028,14 +6028,7 @@
           <w:rFonts w:cs="Times New Roman"/>
           <w:noProof/>
         </w:rPr>
-        <w:t>Use Case Diagram</w:t>
-      </w:r>
-      <w:r>
-        <w:rPr>
-          <w:rFonts w:cs="Times New Roman"/>
-          <w:noProof/>
-        </w:rPr>
-        <w:t xml:space="preserve"> </w:t>
+        <w:t xml:space="preserve">Use Case Diagram </w:t>
       </w:r>
       <w:r>
         <w:rPr>
@@ -8826,15 +8819,7 @@
                 <w:szCs w:val="26"/>
                 <w:lang w:val="en-US"/>
               </w:rPr>
-              <w:t xml:space="preserve"> </w:t>
-            </w:r>
-            <w:r>
-              <w:rPr>
-                <w:noProof/>
-                <w:szCs w:val="26"/>
-                <w:lang w:val="en-US"/>
-              </w:rPr>
-              <w:t>thực (</w:t>
+              <w:t xml:space="preserve"> thực (</w:t>
             </w:r>
             <w:r>
               <w:rPr>
@@ -12828,6 +12813,7 @@
                 <w:szCs w:val="26"/>
                 <w:lang w:val="en-US"/>
               </w:rPr>
+              <w:lastRenderedPageBreak/>
               <w:t>Luồng ngoại lệ</w:t>
             </w:r>
           </w:p>
@@ -14616,6 +14602,7 @@
                 <w:szCs w:val="26"/>
                 <w:lang w:val="en-US"/>
               </w:rPr>
+              <w:lastRenderedPageBreak/>
               <w:t>Luồng ngoại lệ</w:t>
             </w:r>
           </w:p>
@@ -14818,14 +14805,7 @@
                 <w:noProof/>
                 <w:lang w:val="en-US"/>
               </w:rPr>
-              <w:t xml:space="preserve"> </w:t>
-            </w:r>
-            <w:r>
-              <w:rPr>
-                <w:noProof/>
-                <w:lang w:val="en-US"/>
-              </w:rPr>
-              <w:t>khách hàng không đến lấy sách và thanh toán</w:t>
+              <w:t xml:space="preserve"> khách hàng không đến lấy sách và thanh toán</w:t>
             </w:r>
             <w:r>
               <w:rPr>
@@ -20070,6 +20050,7 @@
                 <w:szCs w:val="26"/>
                 <w:lang w:val="en-US"/>
               </w:rPr>
+              <w:lastRenderedPageBreak/>
               <w:t>Luồng thay thế</w:t>
             </w:r>
           </w:p>
@@ -22712,13 +22693,7 @@
         <w:rPr>
           <w:rFonts w:cs="Times New Roman"/>
         </w:rPr>
-        <w:t>Sequence Diagram</w:t>
-      </w:r>
-      <w:r>
-        <w:rPr>
-          <w:rFonts w:cs="Times New Roman"/>
-        </w:rPr>
-        <w:t xml:space="preserve"> </w:t>
+        <w:t xml:space="preserve">Sequence Diagram </w:t>
       </w:r>
       <w:r>
         <w:rPr>
@@ -22944,13 +22919,7 @@
         <w:rPr>
           <w:rFonts w:cs="Times New Roman"/>
         </w:rPr>
-        <w:t>Sequence Diagram</w:t>
-      </w:r>
-      <w:r>
-        <w:rPr>
-          <w:rFonts w:cs="Times New Roman"/>
-        </w:rPr>
-        <w:t xml:space="preserve"> </w:t>
+        <w:t xml:space="preserve">Sequence Diagram </w:t>
       </w:r>
       <w:r>
         <w:rPr>
@@ -23176,13 +23145,7 @@
         <w:rPr>
           <w:rFonts w:cs="Times New Roman"/>
         </w:rPr>
-        <w:t>Sequence Diagram</w:t>
-      </w:r>
-      <w:r>
-        <w:rPr>
-          <w:rFonts w:cs="Times New Roman"/>
-        </w:rPr>
-        <w:t xml:space="preserve"> </w:t>
+        <w:t xml:space="preserve">Sequence Diagram </w:t>
       </w:r>
       <w:r>
         <w:rPr>
@@ -23384,13 +23347,7 @@
         <w:rPr>
           <w:rFonts w:cs="Times New Roman"/>
         </w:rPr>
-        <w:t>Sequence Diagram</w:t>
-      </w:r>
-      <w:r>
-        <w:rPr>
-          <w:rFonts w:cs="Times New Roman"/>
-        </w:rPr>
-        <w:t xml:space="preserve"> </w:t>
+        <w:t xml:space="preserve">Sequence Diagram </w:t>
       </w:r>
       <w:r>
         <w:rPr>
@@ -23612,13 +23569,7 @@
         <w:rPr>
           <w:rFonts w:cs="Times New Roman"/>
         </w:rPr>
-        <w:t>Sequence Diagram</w:t>
-      </w:r>
-      <w:r>
-        <w:rPr>
-          <w:rFonts w:cs="Times New Roman"/>
-        </w:rPr>
-        <w:t xml:space="preserve"> </w:t>
+        <w:t xml:space="preserve">Sequence Diagram </w:t>
       </w:r>
       <w:r>
         <w:rPr>
@@ -23844,13 +23795,7 @@
         <w:rPr>
           <w:rFonts w:cs="Times New Roman"/>
         </w:rPr>
-        <w:t>Sequence Diagram</w:t>
-      </w:r>
-      <w:r>
-        <w:rPr>
-          <w:rFonts w:cs="Times New Roman"/>
-        </w:rPr>
-        <w:t xml:space="preserve"> </w:t>
+        <w:t xml:space="preserve">Sequence Diagram </w:t>
       </w:r>
       <w:r>
         <w:rPr>
@@ -23992,45 +23937,25 @@
       <w:r>
         <w:t xml:space="preserve">Hình </w:t>
       </w:r>
-      <w:r>
-        <w:fldChar w:fldCharType="begin"/>
-      </w:r>
-      <w:r>
-        <w:instrText xml:space="preserve"> STYLEREF 1 \s </w:instrText>
-      </w:r>
-      <w:r>
-        <w:fldChar w:fldCharType="separate"/>
-      </w:r>
-      <w:r>
-        <w:rPr>
-          <w:noProof/>
-        </w:rPr>
-        <w:t>4</w:t>
-      </w:r>
-      <w:r>
-        <w:fldChar w:fldCharType="end"/>
-      </w:r>
+      <w:fldSimple w:instr=" STYLEREF 1 \s ">
+        <w:r>
+          <w:rPr>
+            <w:noProof/>
+          </w:rPr>
+          <w:t>4</w:t>
+        </w:r>
+      </w:fldSimple>
       <w:r>
         <w:t>.</w:t>
       </w:r>
-      <w:r>
-        <w:fldChar w:fldCharType="begin"/>
-      </w:r>
-      <w:r>
-        <w:instrText xml:space="preserve"> SEQ Hình \* ARABIC \s 1 </w:instrText>
-      </w:r>
-      <w:r>
-        <w:fldChar w:fldCharType="separate"/>
-      </w:r>
-      <w:r>
-        <w:rPr>
-          <w:noProof/>
-        </w:rPr>
-        <w:t>9</w:t>
-      </w:r>
-      <w:r>
-        <w:fldChar w:fldCharType="end"/>
-      </w:r>
+      <w:fldSimple w:instr=" SEQ Hình \* ARABIC \s 1 ">
+        <w:r>
+          <w:rPr>
+            <w:noProof/>
+          </w:rPr>
+          <w:t>9</w:t>
+        </w:r>
+      </w:fldSimple>
       <w:r>
         <w:rPr>
           <w:noProof/>

</xml_diff>

<commit_message>
update group homework report - class diagram
</commit_message>
<xml_diff>
--- a/bai-tap/bai-tap-nhom/Bài tập nhóm - Quản lý nhà sách/Báo cáo Bài tập nhóm - Quản lý nhà sách.docx
+++ b/bai-tap/bai-tap-nhom/Bài tập nhóm - Quản lý nhà sách/Báo cáo Bài tập nhóm - Quản lý nhà sách.docx
@@ -14,8 +14,8 @@
         </w:rPr>
       </w:pPr>
       <w:bookmarkStart w:id="0" w:name="_Hlk93040589"/>
-      <w:bookmarkStart w:id="1" w:name="_Toc51061469"/>
-      <w:bookmarkStart w:id="2" w:name="_Toc51060025"/>
+      <w:bookmarkStart w:id="1" w:name="_Toc51060025"/>
+      <w:bookmarkStart w:id="2" w:name="_Toc51061469"/>
       <w:bookmarkEnd w:id="0"/>
       <w:r>
         <w:rPr>
@@ -23874,10 +23874,10 @@
           <w:lang w:val="en-US"/>
         </w:rPr>
         <w:drawing>
-          <wp:inline distT="0" distB="0" distL="0" distR="0" wp14:anchorId="1AF27765" wp14:editId="61849D98">
-            <wp:extent cx="5706398" cy="5768340"/>
-            <wp:effectExtent l="0" t="0" r="8890" b="3810"/>
-            <wp:docPr id="4" name="Picture 4"/>
+          <wp:inline distT="0" distB="0" distL="0" distR="0" wp14:anchorId="74A13102" wp14:editId="7C08A327">
+            <wp:extent cx="5615940" cy="5099957"/>
+            <wp:effectExtent l="0" t="0" r="3810" b="5715"/>
+            <wp:docPr id="2" name="Picture 2"/>
             <wp:cNvGraphicFramePr>
               <a:graphicFrameLocks xmlns:a="http://schemas.openxmlformats.org/drawingml/2006/main" noChangeAspect="1"/>
             </wp:cNvGraphicFramePr>
@@ -23885,7 +23885,7 @@
               <a:graphicData uri="http://schemas.openxmlformats.org/drawingml/2006/picture">
                 <pic:pic xmlns:pic="http://schemas.openxmlformats.org/drawingml/2006/picture">
                   <pic:nvPicPr>
-                    <pic:cNvPr id="0" name="Picture 3"/>
+                    <pic:cNvPr id="0" name="Picture 1"/>
                     <pic:cNvPicPr>
                       <a:picLocks noChangeAspect="1" noChangeArrowheads="1"/>
                     </pic:cNvPicPr>
@@ -23898,13 +23898,13 @@
                         </a:ext>
                       </a:extLst>
                     </a:blip>
-                    <a:srcRect r="3026" b="2869"/>
+                    <a:srcRect r="2384" b="2578"/>
                     <a:stretch/>
                   </pic:blipFill>
                   <pic:spPr bwMode="auto">
                     <a:xfrm>
                       <a:off x="0" y="0"/>
-                      <a:ext cx="5707368" cy="5769321"/>
+                      <a:ext cx="5615940" cy="5099957"/>
                     </a:xfrm>
                     <a:prstGeom prst="rect">
                       <a:avLst/>
@@ -23937,25 +23937,51 @@
       <w:r>
         <w:t xml:space="preserve">Hình </w:t>
       </w:r>
-      <w:fldSimple w:instr=" STYLEREF 1 \s ">
-        <w:r>
-          <w:rPr>
-            <w:noProof/>
-          </w:rPr>
-          <w:t>4</w:t>
-        </w:r>
-      </w:fldSimple>
+      <w:r>
+        <w:fldChar w:fldCharType="begin"/>
+      </w:r>
+      <w:r>
+        <w:instrText xml:space="preserve"> STYLEREF 1 \s </w:instrText>
+      </w:r>
+      <w:r>
+        <w:fldChar w:fldCharType="separate"/>
+      </w:r>
+      <w:r>
+        <w:rPr>
+          <w:noProof/>
+        </w:rPr>
+        <w:t>4</w:t>
+      </w:r>
+      <w:r>
+        <w:rPr>
+          <w:noProof/>
+        </w:rPr>
+        <w:fldChar w:fldCharType="end"/>
+      </w:r>
       <w:r>
         <w:t>.</w:t>
       </w:r>
-      <w:fldSimple w:instr=" SEQ Hình \* ARABIC \s 1 ">
-        <w:r>
-          <w:rPr>
-            <w:noProof/>
-          </w:rPr>
-          <w:t>9</w:t>
-        </w:r>
-      </w:fldSimple>
+      <w:r>
+        <w:fldChar w:fldCharType="begin"/>
+      </w:r>
+      <w:r>
+        <w:instrText xml:space="preserve"> SEQ Hình \* ARABIC \s 1 </w:instrText>
+      </w:r>
+      <w:r>
+        <w:fldChar w:fldCharType="separate"/>
+      </w:r>
+      <w:r>
+        <w:rPr>
+          <w:noProof/>
+        </w:rPr>
+        <w:t>9</w:t>
+      </w:r>
+      <w:r>
+        <w:rPr>
+          <w:noProof/>
+        </w:rPr>
+        <w:fldChar w:fldCharType="end"/>
+      </w:r>
       <w:r>
         <w:rPr>
           <w:noProof/>

</xml_diff>

<commit_message>
update group homework - class diagram
</commit_message>
<xml_diff>
--- a/bai-tap/bai-tap-nhom/Bài tập nhóm - Quản lý nhà sách/Báo cáo Bài tập nhóm - Quản lý nhà sách.docx
+++ b/bai-tap/bai-tap-nhom/Bài tập nhóm - Quản lý nhà sách/Báo cáo Bài tập nhóm - Quản lý nhà sách.docx
@@ -14,8 +14,8 @@
         </w:rPr>
       </w:pPr>
       <w:bookmarkStart w:id="0" w:name="_Hlk93040589"/>
-      <w:bookmarkStart w:id="1" w:name="_Toc51060025"/>
-      <w:bookmarkStart w:id="2" w:name="_Toc51061469"/>
+      <w:bookmarkStart w:id="1" w:name="_Toc51061469"/>
+      <w:bookmarkStart w:id="2" w:name="_Toc51060025"/>
       <w:bookmarkEnd w:id="0"/>
       <w:r>
         <w:rPr>
@@ -1418,21 +1418,7 @@
                 <w:rStyle w:val="Hyperlink"/>
                 <w:noProof/>
               </w:rPr>
-              <w:t xml:space="preserve">Sơ đồ lớp </w:t>
-            </w:r>
-            <w:r>
-              <w:rPr>
-                <w:rStyle w:val="Hyperlink"/>
-                <w:noProof/>
-              </w:rPr>
-              <w:t>(</w:t>
-            </w:r>
-            <w:r>
-              <w:rPr>
-                <w:rStyle w:val="Hyperlink"/>
-                <w:noProof/>
-              </w:rPr>
-              <w:t>Class Diagram)</w:t>
+              <w:t>Sơ đồ lớp (Class Diagram)</w:t>
             </w:r>
             <w:r>
               <w:rPr>
@@ -14821,6 +14807,7 @@
                 <w:szCs w:val="26"/>
                 <w:lang w:val="en-US"/>
               </w:rPr>
+              <w:lastRenderedPageBreak/>
               <w:t>Luồng ngoại lệ</w:t>
             </w:r>
           </w:p>
@@ -16609,6 +16596,7 @@
                 <w:szCs w:val="26"/>
                 <w:lang w:val="en-US"/>
               </w:rPr>
+              <w:lastRenderedPageBreak/>
               <w:t>Luồng ngoại lệ</w:t>
             </w:r>
           </w:p>
@@ -19972,6 +19960,7 @@
         <w:rPr>
           <w:rFonts w:cs="Times New Roman"/>
         </w:rPr>
+        <w:lastRenderedPageBreak/>
         <w:t xml:space="preserve">Bảng </w:t>
       </w:r>
       <w:r>
@@ -22055,6 +22044,7 @@
                 <w:szCs w:val="26"/>
                 <w:lang w:val="en-US"/>
               </w:rPr>
+              <w:lastRenderedPageBreak/>
               <w:t>Luồng thay thế</w:t>
             </w:r>
           </w:p>
@@ -25875,10 +25865,10 @@
           <w:lang w:val="en-US"/>
         </w:rPr>
         <w:drawing>
-          <wp:inline distT="0" distB="0" distL="0" distR="0" wp14:anchorId="7DC24553" wp14:editId="3629D00D">
-            <wp:extent cx="5611495" cy="5138057"/>
-            <wp:effectExtent l="0" t="0" r="8255" b="5715"/>
-            <wp:docPr id="18" name="Picture 18"/>
+          <wp:inline distT="0" distB="0" distL="0" distR="0" wp14:anchorId="3E3A3B9C" wp14:editId="1AEA8619">
+            <wp:extent cx="5615305" cy="5128847"/>
+            <wp:effectExtent l="0" t="0" r="4445" b="0"/>
+            <wp:docPr id="4" name="Picture 4"/>
             <wp:cNvGraphicFramePr>
               <a:graphicFrameLocks xmlns:a="http://schemas.openxmlformats.org/drawingml/2006/main" noChangeAspect="1"/>
             </wp:cNvGraphicFramePr>
@@ -25899,13 +25889,13 @@
                         </a:ext>
                       </a:extLst>
                     </a:blip>
-                    <a:srcRect r="2460" b="2699"/>
+                    <a:srcRect r="2469" b="2921"/>
                     <a:stretch/>
                   </pic:blipFill>
                   <pic:spPr bwMode="auto">
                     <a:xfrm>
                       <a:off x="0" y="0"/>
-                      <a:ext cx="5611585" cy="5138139"/>
+                      <a:ext cx="5615354" cy="5128892"/>
                     </a:xfrm>
                     <a:prstGeom prst="rect">
                       <a:avLst/>
@@ -25938,51 +25928,25 @@
       <w:r>
         <w:t xml:space="preserve">Hình </w:t>
       </w:r>
-      <w:r>
-        <w:fldChar w:fldCharType="begin"/>
-      </w:r>
-      <w:r>
-        <w:instrText xml:space="preserve"> STYLEREF 1 \s </w:instrText>
-      </w:r>
-      <w:r>
-        <w:fldChar w:fldCharType="separate"/>
-      </w:r>
-      <w:r>
-        <w:rPr>
-          <w:noProof/>
-        </w:rPr>
-        <w:t>4</w:t>
-      </w:r>
-      <w:r>
-        <w:rPr>
-          <w:noProof/>
-        </w:rPr>
-        <w:fldChar w:fldCharType="end"/>
-      </w:r>
+      <w:fldSimple w:instr=" STYLEREF 1 \s ">
+        <w:r>
+          <w:rPr>
+            <w:noProof/>
+          </w:rPr>
+          <w:t>4</w:t>
+        </w:r>
+      </w:fldSimple>
       <w:r>
         <w:t>.</w:t>
       </w:r>
-      <w:r>
-        <w:fldChar w:fldCharType="begin"/>
-      </w:r>
-      <w:r>
-        <w:instrText xml:space="preserve"> SEQ Hình \* ARABIC \s 1 </w:instrText>
-      </w:r>
-      <w:r>
-        <w:fldChar w:fldCharType="separate"/>
-      </w:r>
-      <w:r>
-        <w:rPr>
-          <w:noProof/>
-        </w:rPr>
-        <w:t>9</w:t>
-      </w:r>
-      <w:r>
-        <w:rPr>
-          <w:noProof/>
-        </w:rPr>
-        <w:fldChar w:fldCharType="end"/>
-      </w:r>
+      <w:fldSimple w:instr=" SEQ Hình \* ARABIC \s 1 ">
+        <w:r>
+          <w:rPr>
+            <w:noProof/>
+          </w:rPr>
+          <w:t>9</w:t>
+        </w:r>
+      </w:fldSimple>
       <w:r>
         <w:rPr>
           <w:noProof/>
@@ -26150,51 +26114,25 @@
       <w:r>
         <w:t xml:space="preserve">Hình </w:t>
       </w:r>
-      <w:r>
-        <w:fldChar w:fldCharType="begin"/>
-      </w:r>
-      <w:r>
-        <w:instrText xml:space="preserve"> STYLEREF 1 \s </w:instrText>
-      </w:r>
-      <w:r>
-        <w:fldChar w:fldCharType="separate"/>
-      </w:r>
-      <w:r>
-        <w:rPr>
-          <w:noProof/>
-        </w:rPr>
-        <w:t>4</w:t>
-      </w:r>
-      <w:r>
-        <w:rPr>
-          <w:noProof/>
-        </w:rPr>
-        <w:fldChar w:fldCharType="end"/>
-      </w:r>
+      <w:fldSimple w:instr=" STYLEREF 1 \s ">
+        <w:r>
+          <w:rPr>
+            <w:noProof/>
+          </w:rPr>
+          <w:t>4</w:t>
+        </w:r>
+      </w:fldSimple>
       <w:r>
         <w:t>.</w:t>
       </w:r>
-      <w:r>
-        <w:fldChar w:fldCharType="begin"/>
-      </w:r>
-      <w:r>
-        <w:instrText xml:space="preserve"> SEQ Hình \* ARABIC \s 1 </w:instrText>
-      </w:r>
-      <w:r>
-        <w:fldChar w:fldCharType="separate"/>
-      </w:r>
-      <w:r>
-        <w:rPr>
-          <w:noProof/>
-        </w:rPr>
-        <w:t>10</w:t>
-      </w:r>
-      <w:r>
-        <w:rPr>
-          <w:noProof/>
-        </w:rPr>
-        <w:fldChar w:fldCharType="end"/>
-      </w:r>
+      <w:fldSimple w:instr=" SEQ Hình \* ARABIC \s 1 ">
+        <w:r>
+          <w:rPr>
+            <w:noProof/>
+          </w:rPr>
+          <w:t>10</w:t>
+        </w:r>
+      </w:fldSimple>
       <w:r>
         <w:rPr>
           <w:noProof/>
@@ -26660,51 +26598,25 @@
       <w:r>
         <w:t xml:space="preserve">Bảng </w:t>
       </w:r>
-      <w:r>
-        <w:fldChar w:fldCharType="begin"/>
-      </w:r>
-      <w:r>
-        <w:instrText xml:space="preserve"> STYLEREF 1 \s </w:instrText>
-      </w:r>
-      <w:r>
-        <w:fldChar w:fldCharType="separate"/>
-      </w:r>
-      <w:r>
-        <w:rPr>
-          <w:noProof/>
-        </w:rPr>
-        <w:t>4</w:t>
-      </w:r>
-      <w:r>
-        <w:rPr>
-          <w:noProof/>
-        </w:rPr>
-        <w:fldChar w:fldCharType="end"/>
-      </w:r>
+      <w:fldSimple w:instr=" STYLEREF 1 \s ">
+        <w:r>
+          <w:rPr>
+            <w:noProof/>
+          </w:rPr>
+          <w:t>4</w:t>
+        </w:r>
+      </w:fldSimple>
       <w:r>
         <w:t>.</w:t>
       </w:r>
-      <w:r>
-        <w:fldChar w:fldCharType="begin"/>
-      </w:r>
-      <w:r>
-        <w:instrText xml:space="preserve"> SEQ Bảng \* ARABIC \s 1 </w:instrText>
-      </w:r>
-      <w:r>
-        <w:fldChar w:fldCharType="separate"/>
-      </w:r>
-      <w:r>
-        <w:rPr>
-          <w:noProof/>
-        </w:rPr>
-        <w:t>15</w:t>
-      </w:r>
-      <w:r>
-        <w:rPr>
-          <w:noProof/>
-        </w:rPr>
-        <w:fldChar w:fldCharType="end"/>
-      </w:r>
+      <w:fldSimple w:instr=" SEQ Bảng \* ARABIC \s 1 ">
+        <w:r>
+          <w:rPr>
+            <w:noProof/>
+          </w:rPr>
+          <w:t>15</w:t>
+        </w:r>
+      </w:fldSimple>
       <w:r>
         <w:rPr>
           <w:lang w:val="en-US"/>
@@ -26838,51 +26750,25 @@
       <w:r>
         <w:t xml:space="preserve">Hình </w:t>
       </w:r>
-      <w:r>
-        <w:fldChar w:fldCharType="begin"/>
-      </w:r>
-      <w:r>
-        <w:instrText xml:space="preserve"> STYLEREF 1 \s </w:instrText>
-      </w:r>
-      <w:r>
-        <w:fldChar w:fldCharType="separate"/>
-      </w:r>
-      <w:r>
-        <w:rPr>
-          <w:noProof/>
-        </w:rPr>
-        <w:t>4</w:t>
-      </w:r>
-      <w:r>
-        <w:rPr>
-          <w:noProof/>
-        </w:rPr>
-        <w:fldChar w:fldCharType="end"/>
-      </w:r>
+      <w:fldSimple w:instr=" STYLEREF 1 \s ">
+        <w:r>
+          <w:rPr>
+            <w:noProof/>
+          </w:rPr>
+          <w:t>4</w:t>
+        </w:r>
+      </w:fldSimple>
       <w:r>
         <w:t>.</w:t>
       </w:r>
-      <w:r>
-        <w:fldChar w:fldCharType="begin"/>
-      </w:r>
-      <w:r>
-        <w:instrText xml:space="preserve"> SEQ Hình \* ARABIC \s 1 </w:instrText>
-      </w:r>
-      <w:r>
-        <w:fldChar w:fldCharType="separate"/>
-      </w:r>
-      <w:r>
-        <w:rPr>
-          <w:noProof/>
-        </w:rPr>
-        <w:t>11</w:t>
-      </w:r>
-      <w:r>
-        <w:rPr>
-          <w:noProof/>
-        </w:rPr>
-        <w:fldChar w:fldCharType="end"/>
-      </w:r>
+      <w:fldSimple w:instr=" SEQ Hình \* ARABIC \s 1 ">
+        <w:r>
+          <w:rPr>
+            <w:noProof/>
+          </w:rPr>
+          <w:t>11</w:t>
+        </w:r>
+      </w:fldSimple>
       <w:r>
         <w:rPr>
           <w:noProof/>
@@ -27356,51 +27242,25 @@
       <w:r>
         <w:t xml:space="preserve">Bảng </w:t>
       </w:r>
-      <w:r>
-        <w:fldChar w:fldCharType="begin"/>
-      </w:r>
-      <w:r>
-        <w:instrText xml:space="preserve"> STYLEREF 1 \s </w:instrText>
-      </w:r>
-      <w:r>
-        <w:fldChar w:fldCharType="separate"/>
-      </w:r>
-      <w:r>
-        <w:rPr>
-          <w:noProof/>
-        </w:rPr>
-        <w:t>4</w:t>
-      </w:r>
-      <w:r>
-        <w:rPr>
-          <w:noProof/>
-        </w:rPr>
-        <w:fldChar w:fldCharType="end"/>
-      </w:r>
+      <w:fldSimple w:instr=" STYLEREF 1 \s ">
+        <w:r>
+          <w:rPr>
+            <w:noProof/>
+          </w:rPr>
+          <w:t>4</w:t>
+        </w:r>
+      </w:fldSimple>
       <w:r>
         <w:t>.</w:t>
       </w:r>
-      <w:r>
-        <w:fldChar w:fldCharType="begin"/>
-      </w:r>
-      <w:r>
-        <w:instrText xml:space="preserve"> SEQ Bảng \* ARABIC \s 1 </w:instrText>
-      </w:r>
-      <w:r>
-        <w:fldChar w:fldCharType="separate"/>
-      </w:r>
-      <w:r>
-        <w:rPr>
-          <w:noProof/>
-        </w:rPr>
-        <w:t>16</w:t>
-      </w:r>
-      <w:r>
-        <w:rPr>
-          <w:noProof/>
-        </w:rPr>
-        <w:fldChar w:fldCharType="end"/>
-      </w:r>
+      <w:fldSimple w:instr=" SEQ Bảng \* ARABIC \s 1 ">
+        <w:r>
+          <w:rPr>
+            <w:noProof/>
+          </w:rPr>
+          <w:t>16</w:t>
+        </w:r>
+      </w:fldSimple>
       <w:r>
         <w:rPr>
           <w:lang w:val="en-US"/>
@@ -27518,51 +27378,25 @@
       <w:r>
         <w:t xml:space="preserve">Hình </w:t>
       </w:r>
-      <w:r>
-        <w:fldChar w:fldCharType="begin"/>
-      </w:r>
-      <w:r>
-        <w:instrText xml:space="preserve"> STYLEREF 1 \s </w:instrText>
-      </w:r>
-      <w:r>
-        <w:fldChar w:fldCharType="separate"/>
-      </w:r>
-      <w:r>
-        <w:rPr>
-          <w:noProof/>
-        </w:rPr>
-        <w:t>4</w:t>
-      </w:r>
-      <w:r>
-        <w:rPr>
-          <w:noProof/>
-        </w:rPr>
-        <w:fldChar w:fldCharType="end"/>
-      </w:r>
+      <w:fldSimple w:instr=" STYLEREF 1 \s ">
+        <w:r>
+          <w:rPr>
+            <w:noProof/>
+          </w:rPr>
+          <w:t>4</w:t>
+        </w:r>
+      </w:fldSimple>
       <w:r>
         <w:t>.</w:t>
       </w:r>
-      <w:r>
-        <w:fldChar w:fldCharType="begin"/>
-      </w:r>
-      <w:r>
-        <w:instrText xml:space="preserve"> SEQ Hình \* ARABIC \s 1 </w:instrText>
-      </w:r>
-      <w:r>
-        <w:fldChar w:fldCharType="separate"/>
-      </w:r>
-      <w:r>
-        <w:rPr>
-          <w:noProof/>
-        </w:rPr>
-        <w:t>12</w:t>
-      </w:r>
-      <w:r>
-        <w:rPr>
-          <w:noProof/>
-        </w:rPr>
-        <w:fldChar w:fldCharType="end"/>
-      </w:r>
+      <w:fldSimple w:instr=" SEQ Hình \* ARABIC \s 1 ">
+        <w:r>
+          <w:rPr>
+            <w:noProof/>
+          </w:rPr>
+          <w:t>12</w:t>
+        </w:r>
+      </w:fldSimple>
       <w:r>
         <w:rPr>
           <w:noProof/>
@@ -28039,51 +27873,25 @@
       <w:r>
         <w:t xml:space="preserve">Bảng </w:t>
       </w:r>
-      <w:r>
-        <w:fldChar w:fldCharType="begin"/>
-      </w:r>
-      <w:r>
-        <w:instrText xml:space="preserve"> STYLEREF 1 \s </w:instrText>
-      </w:r>
-      <w:r>
-        <w:fldChar w:fldCharType="separate"/>
-      </w:r>
-      <w:r>
-        <w:rPr>
-          <w:noProof/>
-        </w:rPr>
-        <w:t>4</w:t>
-      </w:r>
-      <w:r>
-        <w:rPr>
-          <w:noProof/>
-        </w:rPr>
-        <w:fldChar w:fldCharType="end"/>
-      </w:r>
+      <w:fldSimple w:instr=" STYLEREF 1 \s ">
+        <w:r>
+          <w:rPr>
+            <w:noProof/>
+          </w:rPr>
+          <w:t>4</w:t>
+        </w:r>
+      </w:fldSimple>
       <w:r>
         <w:t>.</w:t>
       </w:r>
-      <w:r>
-        <w:fldChar w:fldCharType="begin"/>
-      </w:r>
-      <w:r>
-        <w:instrText xml:space="preserve"> SEQ Bảng \* ARABIC \s 1 </w:instrText>
-      </w:r>
-      <w:r>
-        <w:fldChar w:fldCharType="separate"/>
-      </w:r>
-      <w:r>
-        <w:rPr>
-          <w:noProof/>
-        </w:rPr>
-        <w:t>17</w:t>
-      </w:r>
-      <w:r>
-        <w:rPr>
-          <w:noProof/>
-        </w:rPr>
-        <w:fldChar w:fldCharType="end"/>
-      </w:r>
+      <w:fldSimple w:instr=" SEQ Bảng \* ARABIC \s 1 ">
+        <w:r>
+          <w:rPr>
+            <w:noProof/>
+          </w:rPr>
+          <w:t>17</w:t>
+        </w:r>
+      </w:fldSimple>
       <w:r>
         <w:rPr>
           <w:lang w:val="en-US"/>
@@ -28189,51 +27997,25 @@
       <w:r>
         <w:t xml:space="preserve">Hình </w:t>
       </w:r>
-      <w:r>
-        <w:fldChar w:fldCharType="begin"/>
-      </w:r>
-      <w:r>
-        <w:instrText xml:space="preserve"> STYLEREF 1 \s </w:instrText>
-      </w:r>
-      <w:r>
-        <w:fldChar w:fldCharType="separate"/>
-      </w:r>
-      <w:r>
-        <w:rPr>
-          <w:noProof/>
-        </w:rPr>
-        <w:t>4</w:t>
-      </w:r>
-      <w:r>
-        <w:rPr>
-          <w:noProof/>
-        </w:rPr>
-        <w:fldChar w:fldCharType="end"/>
-      </w:r>
+      <w:fldSimple w:instr=" STYLEREF 1 \s ">
+        <w:r>
+          <w:rPr>
+            <w:noProof/>
+          </w:rPr>
+          <w:t>4</w:t>
+        </w:r>
+      </w:fldSimple>
       <w:r>
         <w:t>.</w:t>
       </w:r>
-      <w:r>
-        <w:fldChar w:fldCharType="begin"/>
-      </w:r>
-      <w:r>
-        <w:instrText xml:space="preserve"> SEQ Hình \* ARABIC \s 1 </w:instrText>
-      </w:r>
-      <w:r>
-        <w:fldChar w:fldCharType="separate"/>
-      </w:r>
-      <w:r>
-        <w:rPr>
-          <w:noProof/>
-        </w:rPr>
-        <w:t>13</w:t>
-      </w:r>
-      <w:r>
-        <w:rPr>
-          <w:noProof/>
-        </w:rPr>
-        <w:fldChar w:fldCharType="end"/>
-      </w:r>
+      <w:fldSimple w:instr=" SEQ Hình \* ARABIC \s 1 ">
+        <w:r>
+          <w:rPr>
+            <w:noProof/>
+          </w:rPr>
+          <w:t>13</w:t>
+        </w:r>
+      </w:fldSimple>
       <w:r>
         <w:rPr>
           <w:noProof/>
@@ -28677,51 +28459,25 @@
       <w:r>
         <w:t xml:space="preserve">Bảng </w:t>
       </w:r>
-      <w:r>
-        <w:fldChar w:fldCharType="begin"/>
-      </w:r>
-      <w:r>
-        <w:instrText xml:space="preserve"> STYLEREF 1 \s </w:instrText>
-      </w:r>
-      <w:r>
-        <w:fldChar w:fldCharType="separate"/>
-      </w:r>
-      <w:r>
-        <w:rPr>
-          <w:noProof/>
-        </w:rPr>
-        <w:t>4</w:t>
-      </w:r>
-      <w:r>
-        <w:rPr>
-          <w:noProof/>
-        </w:rPr>
-        <w:fldChar w:fldCharType="end"/>
-      </w:r>
+      <w:fldSimple w:instr=" STYLEREF 1 \s ">
+        <w:r>
+          <w:rPr>
+            <w:noProof/>
+          </w:rPr>
+          <w:t>4</w:t>
+        </w:r>
+      </w:fldSimple>
       <w:r>
         <w:t>.</w:t>
       </w:r>
-      <w:r>
-        <w:fldChar w:fldCharType="begin"/>
-      </w:r>
-      <w:r>
-        <w:instrText xml:space="preserve"> SEQ Bảng \* ARABIC \s 1 </w:instrText>
-      </w:r>
-      <w:r>
-        <w:fldChar w:fldCharType="separate"/>
-      </w:r>
-      <w:r>
-        <w:rPr>
-          <w:noProof/>
-        </w:rPr>
-        <w:t>18</w:t>
-      </w:r>
-      <w:r>
-        <w:rPr>
-          <w:noProof/>
-        </w:rPr>
-        <w:fldChar w:fldCharType="end"/>
-      </w:r>
+      <w:fldSimple w:instr=" SEQ Bảng \* ARABIC \s 1 ">
+        <w:r>
+          <w:rPr>
+            <w:noProof/>
+          </w:rPr>
+          <w:t>18</w:t>
+        </w:r>
+      </w:fldSimple>
       <w:r>
         <w:rPr>
           <w:lang w:val="en-US"/>
@@ -28849,51 +28605,25 @@
       <w:r>
         <w:t xml:space="preserve">Hình </w:t>
       </w:r>
-      <w:r>
-        <w:fldChar w:fldCharType="begin"/>
-      </w:r>
-      <w:r>
-        <w:instrText xml:space="preserve"> STYLEREF 1 \s </w:instrText>
-      </w:r>
-      <w:r>
-        <w:fldChar w:fldCharType="separate"/>
-      </w:r>
-      <w:r>
-        <w:rPr>
-          <w:noProof/>
-        </w:rPr>
-        <w:t>4</w:t>
-      </w:r>
-      <w:r>
-        <w:rPr>
-          <w:noProof/>
-        </w:rPr>
-        <w:fldChar w:fldCharType="end"/>
-      </w:r>
+      <w:fldSimple w:instr=" STYLEREF 1 \s ">
+        <w:r>
+          <w:rPr>
+            <w:noProof/>
+          </w:rPr>
+          <w:t>4</w:t>
+        </w:r>
+      </w:fldSimple>
       <w:r>
         <w:t>.</w:t>
       </w:r>
-      <w:r>
-        <w:fldChar w:fldCharType="begin"/>
-      </w:r>
-      <w:r>
-        <w:instrText xml:space="preserve"> SEQ Hình \* ARABIC \s 1 </w:instrText>
-      </w:r>
-      <w:r>
-        <w:fldChar w:fldCharType="separate"/>
-      </w:r>
-      <w:r>
-        <w:rPr>
-          <w:noProof/>
-        </w:rPr>
-        <w:t>14</w:t>
-      </w:r>
-      <w:r>
-        <w:rPr>
-          <w:noProof/>
-        </w:rPr>
-        <w:fldChar w:fldCharType="end"/>
-      </w:r>
+      <w:fldSimple w:instr=" SEQ Hình \* ARABIC \s 1 ">
+        <w:r>
+          <w:rPr>
+            <w:noProof/>
+          </w:rPr>
+          <w:t>14</w:t>
+        </w:r>
+      </w:fldSimple>
       <w:r>
         <w:rPr>
           <w:noProof/>
@@ -29355,51 +29085,25 @@
       <w:r>
         <w:t xml:space="preserve">Bảng </w:t>
       </w:r>
-      <w:r>
-        <w:fldChar w:fldCharType="begin"/>
-      </w:r>
-      <w:r>
-        <w:instrText xml:space="preserve"> STYLEREF 1 \s </w:instrText>
-      </w:r>
-      <w:r>
-        <w:fldChar w:fldCharType="separate"/>
-      </w:r>
-      <w:r>
-        <w:rPr>
-          <w:noProof/>
-        </w:rPr>
-        <w:t>4</w:t>
-      </w:r>
-      <w:r>
-        <w:rPr>
-          <w:noProof/>
-        </w:rPr>
-        <w:fldChar w:fldCharType="end"/>
-      </w:r>
+      <w:fldSimple w:instr=" STYLEREF 1 \s ">
+        <w:r>
+          <w:rPr>
+            <w:noProof/>
+          </w:rPr>
+          <w:t>4</w:t>
+        </w:r>
+      </w:fldSimple>
       <w:r>
         <w:t>.</w:t>
       </w:r>
-      <w:r>
-        <w:fldChar w:fldCharType="begin"/>
-      </w:r>
-      <w:r>
-        <w:instrText xml:space="preserve"> SEQ Bảng \* ARABIC \s 1 </w:instrText>
-      </w:r>
-      <w:r>
-        <w:fldChar w:fldCharType="separate"/>
-      </w:r>
-      <w:r>
-        <w:rPr>
-          <w:noProof/>
-        </w:rPr>
-        <w:t>19</w:t>
-      </w:r>
-      <w:r>
-        <w:rPr>
-          <w:noProof/>
-        </w:rPr>
-        <w:fldChar w:fldCharType="end"/>
-      </w:r>
+      <w:fldSimple w:instr=" SEQ Bảng \* ARABIC \s 1 ">
+        <w:r>
+          <w:rPr>
+            <w:noProof/>
+          </w:rPr>
+          <w:t>19</w:t>
+        </w:r>
+      </w:fldSimple>
       <w:r>
         <w:rPr>
           <w:lang w:val="en-US"/>
@@ -29502,51 +29206,25 @@
       <w:r>
         <w:t xml:space="preserve">Hình </w:t>
       </w:r>
-      <w:r>
-        <w:fldChar w:fldCharType="begin"/>
-      </w:r>
-      <w:r>
-        <w:instrText xml:space="preserve"> STYLEREF 1 \s </w:instrText>
-      </w:r>
-      <w:r>
-        <w:fldChar w:fldCharType="separate"/>
-      </w:r>
-      <w:r>
-        <w:rPr>
-          <w:noProof/>
-        </w:rPr>
-        <w:t>4</w:t>
-      </w:r>
-      <w:r>
-        <w:rPr>
-          <w:noProof/>
-        </w:rPr>
-        <w:fldChar w:fldCharType="end"/>
-      </w:r>
+      <w:fldSimple w:instr=" STYLEREF 1 \s ">
+        <w:r>
+          <w:rPr>
+            <w:noProof/>
+          </w:rPr>
+          <w:t>4</w:t>
+        </w:r>
+      </w:fldSimple>
       <w:r>
         <w:t>.</w:t>
       </w:r>
-      <w:r>
-        <w:fldChar w:fldCharType="begin"/>
-      </w:r>
-      <w:r>
-        <w:instrText xml:space="preserve"> SEQ Hình \* ARABIC \s 1 </w:instrText>
-      </w:r>
-      <w:r>
-        <w:fldChar w:fldCharType="separate"/>
-      </w:r>
-      <w:r>
-        <w:rPr>
-          <w:noProof/>
-        </w:rPr>
-        <w:t>15</w:t>
-      </w:r>
-      <w:r>
-        <w:rPr>
-          <w:noProof/>
-        </w:rPr>
-        <w:fldChar w:fldCharType="end"/>
-      </w:r>
+      <w:fldSimple w:instr=" SEQ Hình \* ARABIC \s 1 ">
+        <w:r>
+          <w:rPr>
+            <w:noProof/>
+          </w:rPr>
+          <w:t>15</w:t>
+        </w:r>
+      </w:fldSimple>
       <w:r>
         <w:rPr>
           <w:noProof/>
@@ -30305,51 +29983,25 @@
       <w:r>
         <w:t xml:space="preserve">Bảng </w:t>
       </w:r>
-      <w:r>
-        <w:fldChar w:fldCharType="begin"/>
-      </w:r>
-      <w:r>
-        <w:instrText xml:space="preserve"> STYLEREF 1 \s </w:instrText>
-      </w:r>
-      <w:r>
-        <w:fldChar w:fldCharType="separate"/>
-      </w:r>
-      <w:r>
-        <w:rPr>
-          <w:noProof/>
-        </w:rPr>
-        <w:t>4</w:t>
-      </w:r>
-      <w:r>
-        <w:rPr>
-          <w:noProof/>
-        </w:rPr>
-        <w:fldChar w:fldCharType="end"/>
-      </w:r>
+      <w:fldSimple w:instr=" STYLEREF 1 \s ">
+        <w:r>
+          <w:rPr>
+            <w:noProof/>
+          </w:rPr>
+          <w:t>4</w:t>
+        </w:r>
+      </w:fldSimple>
       <w:r>
         <w:t>.</w:t>
       </w:r>
-      <w:r>
-        <w:fldChar w:fldCharType="begin"/>
-      </w:r>
-      <w:r>
-        <w:instrText xml:space="preserve"> SEQ Bảng \* ARABIC \s 1 </w:instrText>
-      </w:r>
-      <w:r>
-        <w:fldChar w:fldCharType="separate"/>
-      </w:r>
-      <w:r>
-        <w:rPr>
-          <w:noProof/>
-        </w:rPr>
-        <w:t>20</w:t>
-      </w:r>
-      <w:r>
-        <w:rPr>
-          <w:noProof/>
-        </w:rPr>
-        <w:fldChar w:fldCharType="end"/>
-      </w:r>
+      <w:fldSimple w:instr=" SEQ Bảng \* ARABIC \s 1 ">
+        <w:r>
+          <w:rPr>
+            <w:noProof/>
+          </w:rPr>
+          <w:t>20</w:t>
+        </w:r>
+      </w:fldSimple>
       <w:r>
         <w:rPr>
           <w:lang w:val="en-US"/>
@@ -30448,51 +30100,25 @@
       <w:r>
         <w:t xml:space="preserve">Hình </w:t>
       </w:r>
-      <w:r>
-        <w:fldChar w:fldCharType="begin"/>
-      </w:r>
-      <w:r>
-        <w:instrText xml:space="preserve"> STYLEREF 1 \s </w:instrText>
-      </w:r>
-      <w:r>
-        <w:fldChar w:fldCharType="separate"/>
-      </w:r>
-      <w:r>
-        <w:rPr>
-          <w:noProof/>
-        </w:rPr>
-        <w:t>4</w:t>
-      </w:r>
-      <w:r>
-        <w:rPr>
-          <w:noProof/>
-        </w:rPr>
-        <w:fldChar w:fldCharType="end"/>
-      </w:r>
+      <w:fldSimple w:instr=" STYLEREF 1 \s ">
+        <w:r>
+          <w:rPr>
+            <w:noProof/>
+          </w:rPr>
+          <w:t>4</w:t>
+        </w:r>
+      </w:fldSimple>
       <w:r>
         <w:t>.</w:t>
       </w:r>
-      <w:r>
-        <w:fldChar w:fldCharType="begin"/>
-      </w:r>
-      <w:r>
-        <w:instrText xml:space="preserve"> SEQ Hình \* ARABIC \s 1 </w:instrText>
-      </w:r>
-      <w:r>
-        <w:fldChar w:fldCharType="separate"/>
-      </w:r>
-      <w:r>
-        <w:rPr>
-          <w:noProof/>
-        </w:rPr>
-        <w:t>16</w:t>
-      </w:r>
-      <w:r>
-        <w:rPr>
-          <w:noProof/>
-        </w:rPr>
-        <w:fldChar w:fldCharType="end"/>
-      </w:r>
+      <w:fldSimple w:instr=" SEQ Hình \* ARABIC \s 1 ">
+        <w:r>
+          <w:rPr>
+            <w:noProof/>
+          </w:rPr>
+          <w:t>16</w:t>
+        </w:r>
+      </w:fldSimple>
       <w:r>
         <w:rPr>
           <w:noProof/>
@@ -31150,51 +30776,25 @@
       <w:r>
         <w:t xml:space="preserve">Bảng </w:t>
       </w:r>
-      <w:r>
-        <w:fldChar w:fldCharType="begin"/>
-      </w:r>
-      <w:r>
-        <w:instrText xml:space="preserve"> STYLEREF 1 \s </w:instrText>
-      </w:r>
-      <w:r>
-        <w:fldChar w:fldCharType="separate"/>
-      </w:r>
-      <w:r>
-        <w:rPr>
-          <w:noProof/>
-        </w:rPr>
-        <w:t>4</w:t>
-      </w:r>
-      <w:r>
-        <w:rPr>
-          <w:noProof/>
-        </w:rPr>
-        <w:fldChar w:fldCharType="end"/>
-      </w:r>
+      <w:fldSimple w:instr=" STYLEREF 1 \s ">
+        <w:r>
+          <w:rPr>
+            <w:noProof/>
+          </w:rPr>
+          <w:t>4</w:t>
+        </w:r>
+      </w:fldSimple>
       <w:r>
         <w:t>.</w:t>
       </w:r>
-      <w:r>
-        <w:fldChar w:fldCharType="begin"/>
-      </w:r>
-      <w:r>
-        <w:instrText xml:space="preserve"> SEQ Bảng \* ARABIC \s 1 </w:instrText>
-      </w:r>
-      <w:r>
-        <w:fldChar w:fldCharType="separate"/>
-      </w:r>
-      <w:r>
-        <w:rPr>
-          <w:noProof/>
-        </w:rPr>
-        <w:t>21</w:t>
-      </w:r>
-      <w:r>
-        <w:rPr>
-          <w:noProof/>
-        </w:rPr>
-        <w:fldChar w:fldCharType="end"/>
-      </w:r>
+      <w:fldSimple w:instr=" SEQ Bảng \* ARABIC \s 1 ">
+        <w:r>
+          <w:rPr>
+            <w:noProof/>
+          </w:rPr>
+          <w:t>21</w:t>
+        </w:r>
+      </w:fldSimple>
       <w:r>
         <w:rPr>
           <w:lang w:val="en-US"/>

</xml_diff>